<commit_message>
docs: state of play 2026-09-24 — §5 decided 2026-09-25: analyst-only campaign, B as research champion, P7/P9/model gate queued, P6D deferred
</commit_message>
<xml_diff>
--- a/docs/handoffs/2026-09-24-state-of-play.docx
+++ b/docs/handoffs/2026-09-24-state-of-play.docx
@@ -114,19 +114,138 @@
         <w:t xml:space="preserve"> </w:t>
       </w:r>
       <w:r>
-        <w:t xml:space="preserve">better precision, and costs a fifth of v6 per call. It also emits nothing the</w:t>
-      </w:r>
-      <w:r>
-        <w:t xml:space="preserve"> </w:t>
-      </w:r>
-      <w:r>
-        <w:t xml:space="preserve">allocator consumes. The next action is the gate's own end-to-end check, which</w:t>
-      </w:r>
-      <w:r>
-        <w:t xml:space="preserve"> </w:t>
-      </w:r>
-      <w:r>
-        <w:t xml:space="preserve">has never been run on any candidate: about $16. Start at §2, then §5.</w:t>
+        <w:t xml:space="preserve">better precision, and costs a fifth of v6 per call. Through the portfolio</w:t>
+      </w:r>
+      <w:r>
+        <w:t xml:space="preserve"> </w:t>
+      </w:r>
+      <w:r>
+        <w:t xml:space="preserve">simulator, against v6 on the same model, it is close to a tie on final</w:t>
+      </w:r>
+      <w:r>
+        <w:t xml:space="preserve"> </w:t>
+      </w:r>
+      <w:r>
+        <w:t xml:space="preserve">value and</w:t>
+      </w:r>
+      <w:r>
+        <w:t xml:space="preserve"> </w:t>
+      </w:r>
+      <w:r>
+        <w:rPr>
+          <w:b/>
+        </w:rPr>
+        <w:t xml:space="preserve">30% better on the gate's own risk-adjusted metric, in every</w:t>
+      </w:r>
+      <w:r>
+        <w:rPr>
+          <w:b/>
+        </w:rPr>
+        <w:t xml:space="preserve"> </w:t>
+      </w:r>
+      <w:r>
+        <w:rPr>
+          <w:b/>
+        </w:rPr>
+        <w:t xml:space="preserve">leave-one-ticker-out cut.</w:t>
+      </w:r>
+      <w:r>
+        <w:t xml:space="preserve"> </w:t>
+      </w:r>
+      <w:r>
+        <w:t xml:space="preserve">It has cleared both halves of the gate's test</w:t>
+      </w:r>
+      <w:r>
+        <w:t xml:space="preserve"> </w:t>
+      </w:r>
+      <w:r>
+        <w:t xml:space="preserve">for an analyst change.</w:t>
+      </w:r>
+      <w:r>
+        <w:t xml:space="preserve"> </w:t>
+      </w:r>
+      <w:r>
+        <w:rPr>
+          <w:b/>
+        </w:rPr>
+        <w:t xml:space="preserve">Decided 2026-09-25: the analyst is improved on its</w:t>
+      </w:r>
+      <w:r>
+        <w:rPr>
+          <w:b/>
+        </w:rPr>
+        <w:t xml:space="preserve"> </w:t>
+      </w:r>
+      <w:r>
+        <w:rPr>
+          <w:b/>
+        </w:rPr>
+        <w:t xml:space="preserve">own from here, with B as the research champion and production untouched;</w:t>
+      </w:r>
+      <w:r>
+        <w:rPr>
+          <w:b/>
+        </w:rPr>
+        <w:t xml:space="preserve"> </w:t>
+      </w:r>
+      <w:r>
+        <w:rPr>
+          <w:b/>
+        </w:rPr>
+        <w:t xml:space="preserve">the allocator is rebuilt afterwards around whatever the analyst turns out</w:t>
+      </w:r>
+      <w:r>
+        <w:rPr>
+          <w:b/>
+        </w:rPr>
+        <w:t xml:space="preserve"> </w:t>
+      </w:r>
+      <w:r>
+        <w:rPr>
+          <w:b/>
+        </w:rPr>
+        <w:t xml:space="preserve">to be good at.</w:t>
+      </w:r>
+      <w:r>
+        <w:t xml:space="preserve"> </w:t>
+      </w:r>
+      <w:r>
+        <w:t xml:space="preserve">Start at §2.4, then §5.</w:t>
+      </w:r>
+    </w:p>
+    <w:p>
+      <w:pPr>
+        <w:pStyle w:val="BodyText"/>
+      </w:pPr>
+      <w:r>
+        <w:rPr>
+          <w:b/>
+        </w:rPr>
+        <w:t xml:space="preserve">Updated three times</w:t>
+      </w:r>
+      <w:r>
+        <w:t xml:space="preserve"> </w:t>
+      </w:r>
+      <w:r>
+        <w:t xml:space="preserve">— after the end-to-end check, after the same-model</w:t>
+      </w:r>
+      <w:r>
+        <w:t xml:space="preserve"> </w:t>
+      </w:r>
+      <w:r>
+        <w:t xml:space="preserve">comparator and leave-one-out runs corrected it, and on 2026-09-25 when §5</w:t>
+      </w:r>
+      <w:r>
+        <w:t xml:space="preserve"> </w:t>
+      </w:r>
+      <w:r>
+        <w:t xml:space="preserve">became a decided plan rather than a recommendation. The reading version is</w:t>
+      </w:r>
+      <w:r>
+        <w:t xml:space="preserve"> </w:t>
+      </w:r>
+      <w:r>
+        <w:t xml:space="preserve">republished to the same link.</w:t>
       </w:r>
     </w:p>
     <w:p>
@@ -1142,6 +1261,151 @@
           <w:b/>
         </w:rPr>
         <w:t xml:space="preserve">All four held.</w:t>
+      </w:r>
+    </w:p>
+    <w:p>
+      <w:pPr>
+        <w:pStyle w:val="BodyText"/>
+      </w:pPr>
+      <w:r>
+        <w:rPr>
+          <w:b/>
+        </w:rPr>
+        <w:t xml:space="preserve">P6B end-to-end check ($7.75, simulator).</w:t>
+      </w:r>
+      <w:r>
+        <w:t xml:space="preserve"> </w:t>
+      </w:r>
+      <w:r>
+        <w:t xml:space="preserve">The gate's secondary test,</w:t>
+      </w:r>
+      <w:r>
+        <w:t xml:space="preserve"> </w:t>
+      </w:r>
+      <w:r>
+        <w:t xml:space="preserve">never before run on any candidate: B's score fed through the settled</w:t>
+      </w:r>
+      <w:r>
+        <w:t xml:space="preserve"> </w:t>
+      </w:r>
+      <w:r>
+        <w:t xml:space="preserve">allocator on the ALL16 corpus, against v6 and against v6 stripped to its</w:t>
+      </w:r>
+      <w:r>
+        <w:t xml:space="preserve"> </w:t>
+      </w:r>
+      <w:r>
+        <w:t xml:space="preserve">per-call verdicts.</w:t>
+      </w:r>
+      <w:r>
+        <w:t xml:space="preserve"> </w:t>
+      </w:r>
+      <w:r>
+        <w:rPr>
+          <w:rStyle w:val="VerbatimChar"/>
+        </w:rPr>
+        <w:t xml:space="preserve">wrap-ups/P6B-end-to-end-check-out.md</w:t>
+      </w:r>
+      <w:r>
+        <w:t xml:space="preserve">.</w:t>
+      </w:r>
+      <w:r>
+        <w:t xml:space="preserve"> </w:t>
+      </w:r>
+      <w:r>
+        <w:rPr>
+          <w:b/>
+        </w:rPr>
+        <w:t xml:space="preserve">B exceeded</w:t>
+      </w:r>
+      <w:r>
+        <w:rPr>
+          <w:b/>
+        </w:rPr>
+        <w:t xml:space="preserve"> </w:t>
+      </w:r>
+      <w:r>
+        <w:rPr>
+          <w:b/>
+        </w:rPr>
+        <w:t xml:space="preserve">the check.</w:t>
+      </w:r>
+      <w:r>
+        <w:t xml:space="preserve"> </w:t>
+      </w:r>
+      <w:r>
+        <w:t xml:space="preserve">See §2.4.</w:t>
+      </w:r>
+    </w:p>
+    <w:p>
+      <w:pPr>
+        <w:pStyle w:val="BodyText"/>
+      </w:pPr>
+      <w:r>
+        <w:rPr>
+          <w:b/>
+        </w:rPr>
+        <w:t xml:space="preserve">P6B confound and concentration ($3.56).</w:t>
+      </w:r>
+      <w:r>
+        <w:t xml:space="preserve"> </w:t>
+      </w:r>
+      <w:r>
+        <w:t xml:space="preserve">v6 re-scored on the same</w:t>
+      </w:r>
+      <w:r>
+        <w:t xml:space="preserve"> </w:t>
+      </w:r>
+      <w:r>
+        <w:t xml:space="preserve">model as B and fed through the same overlay (</w:t>
+      </w:r>
+      <w:r>
+        <w:rPr>
+          <w:b/>
+        </w:rPr>
+        <w:t xml:space="preserve">A0′</w:t>
+      </w:r>
+      <w:r>
+        <w:t xml:space="preserve">), plus all sixteen</w:t>
+      </w:r>
+      <w:r>
+        <w:t xml:space="preserve"> </w:t>
+      </w:r>
+      <w:r>
+        <w:t xml:space="preserve">leave-one-ticker-out cuts.</w:t>
+      </w:r>
+      <w:r>
+        <w:t xml:space="preserve"> </w:t>
+      </w:r>
+      <w:r>
+        <w:rPr>
+          <w:rStyle w:val="VerbatimChar"/>
+        </w:rPr>
+        <w:t xml:space="preserve">wrap-ups/P6B-confound-and-concentration-out.md</w:t>
+      </w:r>
+      <w:r>
+        <w:t xml:space="preserve">.</w:t>
+      </w:r>
+      <w:r>
+        <w:t xml:space="preserve"> </w:t>
+      </w:r>
+      <w:r>
+        <w:rPr>
+          <w:b/>
+        </w:rPr>
+        <w:t xml:space="preserve">Corrects §2.4:</w:t>
+      </w:r>
+      <w:r>
+        <w:t xml:space="preserve"> </w:t>
+      </w:r>
+      <w:r>
+        <w:t xml:space="preserve">most of the end-to-end gap was the model, not the</w:t>
+      </w:r>
+      <w:r>
+        <w:t xml:space="preserve"> </w:t>
+      </w:r>
+      <w:r>
+        <w:t xml:space="preserve">prompt; the prompt's share is thin on final value and robust on drawdown.</w:t>
       </w:r>
     </w:p>
     <w:p>
@@ -2125,27 +2389,38 @@
     </w:p>
     <w:p>
       <w:pPr>
-        <w:pStyle w:val="Heading2"/>
-      </w:pPr>
-      <w:bookmarkStart w:id="28" w:name="X19eafd7a445ba4554cd7d51fe7cf387343551c3"/>
-      <w:r>
-        <w:t xml:space="preserve">§3 What this changes</w:t>
+        <w:pStyle w:val="Heading3"/>
+      </w:pPr>
+      <w:bookmarkStart w:id="28" w:name="X177ef480f3058b24d29d22329e73ebb89adfe31"/>
+      <w:r>
+        <w:t xml:space="preserve">2.4 The end-to-end check — B through the allocator, corrected</w:t>
       </w:r>
       <w:bookmarkEnd w:id="28"/>
     </w:p>
     <w:p>
       <w:pPr>
-        <w:numPr>
-          <w:ilvl w:val="0"/>
-          <w:numId w:val="1005"/>
-        </w:numPr>
-        <w:pStyle w:val="Compact"/>
-      </w:pPr>
-      <w:r>
-        <w:rPr>
-          <w:b/>
-        </w:rPr>
-        <w:t xml:space="preserve">The working analyst candidate is the minimal prompt.</w:t>
+        <w:pStyle w:val="FirstParagraph"/>
+      </w:pPr>
+      <w:r>
+        <w:t xml:space="preserve">Settled configuration, 195 events, seed 0, phase-averaged. Every drawdown</w:t>
+      </w:r>
+      <w:r>
+        <w:t xml:space="preserve"> </w:t>
+      </w:r>
+      <w:r>
+        <w:t xml:space="preserve">names its ruler.</w:t>
+      </w:r>
+      <w:r>
+        <w:t xml:space="preserve"> </w:t>
+      </w:r>
+      <w:r>
+        <w:rPr>
+          <w:b/>
+        </w:rPr>
+        <w:t xml:space="preserve">The fair comparator is A0′</w:t>
+      </w:r>
+      <w:r>
+        <w:t xml:space="preserve">: v6 re-scored on</w:t>
       </w:r>
       <w:r>
         <w:t xml:space="preserve"> </w:t>
@@ -2154,910 +2429,26 @@
         <w:rPr>
           <w:rStyle w:val="VerbatimChar"/>
         </w:rPr>
-        <w:t xml:space="preserve">P6B-minimal</w:t>
-      </w:r>
-      <w:r>
-        <w:t xml:space="preserve">,</w:t>
-      </w:r>
-      <w:r>
-        <w:t xml:space="preserve"> </w:t>
-      </w:r>
-      <w:r>
-        <w:t xml:space="preserve">sha</w:t>
-      </w:r>
-      <w:r>
-        <w:t xml:space="preserve"> </w:t>
-      </w:r>
-      <w:r>
-        <w:rPr>
-          <w:rStyle w:val="VerbatimChar"/>
-        </w:rPr>
-        <w:t xml:space="preserve">d1fa5e53…</w:t>
-      </w:r>
-      <w:r>
-        <w:t xml:space="preserve">, registered as a candidate in</w:t>
-      </w:r>
-      <w:r>
-        <w:t xml:space="preserve"> </w:t>
-      </w:r>
-      <w:r>
-        <w:rPr>
-          <w:rStyle w:val="VerbatimChar"/>
-        </w:rPr>
-        <w:t xml:space="preserve">VERSION_REGISTRY.json</w:t>
-      </w:r>
-      <w:r>
-        <w:t xml:space="preserve">.</w:t>
-      </w:r>
-      <w:r>
-        <w:t xml:space="preserve"> </w:t>
-      </w:r>
-      <w:r>
-        <w:t xml:space="preserve">Not promoted; see §5.</w:t>
-      </w:r>
-    </w:p>
-    <w:p>
-      <w:pPr>
-        <w:numPr>
-          <w:ilvl w:val="0"/>
-          <w:numId w:val="1005"/>
-        </w:numPr>
-        <w:pStyle w:val="Compact"/>
-      </w:pPr>
-      <w:r>
-        <w:rPr>
-          <w:b/>
-        </w:rPr>
-        <w:t xml:space="preserve">P7 and P8 iterate from B, not from v6.</w:t>
-      </w:r>
-      <w:r>
-        <w:t xml:space="preserve"> </w:t>
-      </w:r>
-      <w:r>
-        <w:t xml:space="preserve">Fifty lines is the starting</w:t>
-      </w:r>
-      <w:r>
-        <w:t xml:space="preserve"> </w:t>
-      </w:r>
-      <w:r>
-        <w:t xml:space="preserve">point. Any future rubric must earn its length against this control.</w:t>
-      </w:r>
-    </w:p>
-    <w:p>
-      <w:pPr>
-        <w:numPr>
-          <w:ilvl w:val="0"/>
-          <w:numId w:val="1005"/>
-        </w:numPr>
-        <w:pStyle w:val="Compact"/>
-      </w:pPr>
-      <w:r>
-        <w:rPr>
-          <w:b/>
-        </w:rPr>
-        <w:t xml:space="preserve">P1 is closed.</w:t>
-      </w:r>
-      <w:r>
-        <w:t xml:space="preserve"> </w:t>
-      </w:r>
-      <w:r>
-        <w:t xml:space="preserve">It pushed v6 toward bearish by lowering the evidence</w:t>
-      </w:r>
-      <w:r>
-        <w:t xml:space="preserve"> </w:t>
-      </w:r>
-      <w:r>
-        <w:t xml:space="preserve">bar; B reaches the same coverage by changing the output format, without</w:t>
-      </w:r>
-      <w:r>
-        <w:t xml:space="preserve"> </w:t>
-      </w:r>
-      <w:r>
-        <w:t xml:space="preserve">the precision loss P1 predicted for itself.</w:t>
-      </w:r>
-    </w:p>
-    <w:p>
-      <w:pPr>
-        <w:numPr>
-          <w:ilvl w:val="0"/>
-          <w:numId w:val="1005"/>
-        </w:numPr>
-        <w:pStyle w:val="Compact"/>
-      </w:pPr>
-      <w:r>
-        <w:rPr>
-          <w:b/>
-        </w:rPr>
-        <w:t xml:space="preserve">Arm C is closed</w:t>
-      </w:r>
-      <w:r>
-        <w:t xml:space="preserve"> </w:t>
-      </w:r>
-      <w:r>
-        <w:t xml:space="preserve">on train evidence: same signal as B at 66% more cost.</w:t>
-      </w:r>
-    </w:p>
-    <w:p>
-      <w:pPr>
-        <w:numPr>
-          <w:ilvl w:val="0"/>
-          <w:numId w:val="1005"/>
-        </w:numPr>
-        <w:pStyle w:val="Compact"/>
-      </w:pPr>
-      <w:r>
-        <w:rPr>
-          <w:b/>
-        </w:rPr>
-        <w:t xml:space="preserve">The 09-23 queue is superseded.</w:t>
-      </w:r>
-      <w:r>
-        <w:t xml:space="preserve"> </w:t>
-      </w:r>
-      <w:r>
-        <w:t xml:space="preserve">§3.1 (neutral pile) and §3.3 (severity)</w:t>
-      </w:r>
-      <w:r>
-        <w:t xml:space="preserve"> </w:t>
-      </w:r>
-      <w:r>
-        <w:t xml:space="preserve">there are answered by this round: the neutral pile held signal and the</w:t>
-      </w:r>
-      <w:r>
-        <w:t xml:space="preserve"> </w:t>
-      </w:r>
-      <w:r>
-        <w:t xml:space="preserve">format released it; severity grading is still absent and is now a</w:t>
-      </w:r>
-      <w:r>
-        <w:t xml:space="preserve"> </w:t>
-      </w:r>
-      <w:r>
-        <w:t xml:space="preserve">measured gap rather than a hypothesis.</w:t>
-      </w:r>
-    </w:p>
-    <w:p>
-      <w:pPr>
-        <w:pStyle w:val="Heading2"/>
-      </w:pPr>
-      <w:bookmarkStart w:id="29" w:name="X337b60c4e6c0ab6536d7a503ba7fd2f31e6d935"/>
-      <w:r>
-        <w:t xml:space="preserve">§4 The instrument — carried, with three additions</w:t>
-      </w:r>
-      <w:bookmarkEnd w:id="29"/>
-    </w:p>
-    <w:p>
-      <w:pPr>
-        <w:numPr>
-          <w:ilvl w:val="0"/>
-          <w:numId w:val="1006"/>
-        </w:numPr>
-        <w:pStyle w:val="Compact"/>
-      </w:pPr>
-      <w:r>
-        <w:rPr>
-          <w:b/>
-        </w:rPr>
-        <w:t xml:space="preserve">Noise floor is ~17%, not 12.8%.</w:t>
-      </w:r>
-      <w:r>
-        <w:t xml:space="preserve"> </w:t>
-      </w:r>
-      <w:r>
-        <w:t xml:space="preserve">Tune 17.7% (13.5–23.0), train 16.7%,</w:t>
-      </w:r>
-      <w:r>
-        <w:t xml:space="preserve"> </w:t>
-      </w:r>
-      <w:r>
-        <w:t xml:space="preserve">Test 4's 12.8% inside both ranges. v6 disagrees with itself on one call in</w:t>
-      </w:r>
-      <w:r>
-        <w:t xml:space="preserve"> </w:t>
-      </w:r>
-      <w:r>
-        <w:t xml:space="preserve">six.</w:t>
-      </w:r>
-    </w:p>
-    <w:p>
-      <w:pPr>
-        <w:numPr>
-          <w:ilvl w:val="0"/>
-          <w:numId w:val="1006"/>
-        </w:numPr>
-        <w:pStyle w:val="Compact"/>
-      </w:pPr>
-      <w:r>
-        <w:rPr>
-          <w:b/>
-        </w:rPr>
-        <w:t xml:space="preserve">v6's cached baseline leans lucky.</w:t>
-      </w:r>
-      <w:r>
-        <w:t xml:space="preserve"> </w:t>
-      </w:r>
-      <w:r>
-        <w:t xml:space="preserve">Among noise flips where exactly one</w:t>
-      </w:r>
-      <w:r>
-        <w:t xml:space="preserve"> </w:t>
-      </w:r>
-      <w:r>
-        <w:t xml:space="preserve">answer was right, the cached call won 23 times and the fresh call 12</w:t>
-      </w:r>
-      <w:r>
-        <w:t xml:space="preserve"> </w:t>
-      </w:r>
-      <w:r>
-        <w:t xml:space="preserve">(p=0.09, 35 decisive flips). Not settled. If real, every prior comparison</w:t>
-      </w:r>
-      <w:r>
-        <w:t xml:space="preserve"> </w:t>
-      </w:r>
-      <w:r>
-        <w:t xml:space="preserve">flattered v6 slightly and B's result is conservative.</w:t>
-      </w:r>
-      <w:r>
-        <w:t xml:space="preserve"> </w:t>
-      </w:r>
-      <w:r>
-        <w:rPr>
-          <w:b/>
-        </w:rPr>
-        <w:t xml:space="preserve">Nothing in §2.2</w:t>
-      </w:r>
-      <w:r>
-        <w:rPr>
-          <w:b/>
-        </w:rPr>
-        <w:t xml:space="preserve"> </w:t>
-      </w:r>
-      <w:r>
-        <w:rPr>
-          <w:b/>
-        </w:rPr>
-        <w:t xml:space="preserve">depends on it</w:t>
-      </w:r>
-      <w:r>
-        <w:t xml:space="preserve"> </w:t>
-      </w:r>
-      <w:r>
-        <w:t xml:space="preserve">— conditions 1–3 do not use v6's accuracy.</w:t>
-      </w:r>
-    </w:p>
-    <w:p>
-      <w:pPr>
-        <w:numPr>
-          <w:ilvl w:val="0"/>
-          <w:numId w:val="1006"/>
-        </w:numPr>
-        <w:pStyle w:val="Compact"/>
-      </w:pPr>
-      <w:r>
-        <w:rPr>
-          <w:b/>
-        </w:rPr>
-        <w:t xml:space="preserve">Flip-count rules in</w:t>
-      </w:r>
-      <w:r>
-        <w:rPr>
-          <w:b/>
-        </w:rPr>
-        <w:t xml:space="preserve"> </w:t>
-      </w:r>
-      <w:r>
-        <w:rPr>
-          <w:rStyle w:val="VerbatimChar"/>
-          <w:b/>
-        </w:rPr>
-        <w:t xml:space="preserve">PROMPT_ARCHITECTURE.md</w:t>
-      </w:r>
-      <w:r>
-        <w:rPr>
-          <w:b/>
-        </w:rPr>
-        <w:t xml:space="preserve"> </w:t>
-      </w:r>
-      <w:r>
-        <w:rPr>
-          <w:b/>
-        </w:rPr>
-        <w:t xml:space="preserve">§2.4/§2.5 are still</w:t>
-      </w:r>
-      <w:r>
-        <w:rPr>
-          <w:b/>
-        </w:rPr>
-        <w:t xml:space="preserve"> </w:t>
-      </w:r>
-      <w:r>
-        <w:rPr>
-          <w:b/>
-        </w:rPr>
-        <w:t xml:space="preserve">computed on raw flips</w:t>
-      </w:r>
-      <w:r>
-        <w:t xml:space="preserve"> </w:t>
-      </w:r>
-      <w:r>
-        <w:t xml:space="preserve">and still uncorrected. Every flip figure this week</w:t>
-      </w:r>
-      <w:r>
-        <w:t xml:space="preserve"> </w:t>
-      </w:r>
-      <w:r>
-        <w:t xml:space="preserve">was reported raw and net; the file was not edited.</w:t>
-      </w:r>
-    </w:p>
-    <w:p>
-      <w:pPr>
-        <w:numPr>
-          <w:ilvl w:val="0"/>
-          <w:numId w:val="1006"/>
-        </w:numPr>
-        <w:pStyle w:val="Compact"/>
-      </w:pPr>
-      <w:r>
-        <w:rPr>
-          <w:b/>
-        </w:rPr>
-        <w:t xml:space="preserve">A 1.0-point discrepancy</w:t>
-      </w:r>
-      <w:r>
-        <w:t xml:space="preserve"> </w:t>
-      </w:r>
-      <w:r>
-        <w:t xml:space="preserve">in the pooled v6 swap median (7.70 here vs 8.7</w:t>
-      </w:r>
-      <w:r>
-        <w:t xml:space="preserve"> </w:t>
-      </w:r>
-      <w:r>
-        <w:t xml:space="preserve">in the 09-23 document) is unreconciled. The mean reproduces.</w:t>
-      </w:r>
-    </w:p>
-    <w:p>
-      <w:pPr>
-        <w:numPr>
-          <w:ilvl w:val="0"/>
-          <w:numId w:val="1006"/>
-        </w:numPr>
-        <w:pStyle w:val="Compact"/>
-      </w:pPr>
-      <w:r>
-        <w:t xml:space="preserve">The 177-bearish-call resolution limit for subset questions stands; the</w:t>
-      </w:r>
-      <w:r>
-        <w:t xml:space="preserve"> </w:t>
-      </w:r>
-      <w:r>
-        <w:t xml:space="preserve">rank test on all calls is how this round got around it.</w:t>
-      </w:r>
-    </w:p>
-    <w:p>
-      <w:pPr>
-        <w:numPr>
-          <w:ilvl w:val="0"/>
-          <w:numId w:val="1006"/>
-        </w:numPr>
-        <w:pStyle w:val="Compact"/>
-      </w:pPr>
-      <w:r>
-        <w:t xml:space="preserve">Paramount excluded on train (corrupt prices); WOLF, SPWR, BNY (no</w:t>
-      </w:r>
-      <w:r>
-        <w:t xml:space="preserve"> </w:t>
-      </w:r>
-      <w:r>
-        <w:t xml:space="preserve">transcripts) excluded on tune. Dividends ignored. Sector-relative grading</w:t>
-      </w:r>
-      <w:r>
-        <w:t xml:space="preserve"> </w:t>
-      </w:r>
-      <w:r>
-        <w:t xml:space="preserve">unresolved.</w:t>
-      </w:r>
-    </w:p>
-    <w:p>
-      <w:pPr>
-        <w:pStyle w:val="Heading2"/>
-      </w:pPr>
-      <w:bookmarkStart w:id="30" w:name="X7bdb1725a5d45cbefc1cbbaaf974ea72c344412"/>
-      <w:r>
-        <w:t xml:space="preserve">§5 Next action — the end-to-end check, ~$16</w:t>
-      </w:r>
-      <w:bookmarkEnd w:id="30"/>
-    </w:p>
-    <w:p>
-      <w:pPr>
-        <w:pStyle w:val="FirstParagraph"/>
-      </w:pPr>
-      <w:r>
-        <w:rPr>
-          <w:b/>
-        </w:rPr>
-        <w:t xml:space="preserve">B cannot be promoted on §2 alone</w:t>
-      </w:r>
-      <w:r>
-        <w:t xml:space="preserve">, for a reason that is not about the</w:t>
-      </w:r>
-      <w:r>
-        <w:t xml:space="preserve"> </w:t>
-      </w:r>
-      <w:r>
-        <w:t xml:space="preserve">evidence: it emits</w:t>
-      </w:r>
-      <w:r>
-        <w:t xml:space="preserve"> </w:t>
-      </w:r>
-      <w:r>
-        <w:rPr>
-          <w:rStyle w:val="VerbatimChar"/>
-        </w:rPr>
-        <w:t xml:space="preserve">score</w:t>
-      </w:r>
-      <w:r>
-        <w:t xml:space="preserve">,</w:t>
-      </w:r>
-      <w:r>
-        <w:t xml:space="preserve"> </w:t>
-      </w:r>
-      <w:r>
-        <w:rPr>
-          <w:rStyle w:val="VerbatimChar"/>
-        </w:rPr>
-        <w:t xml:space="preserve">noRead</w:t>
-      </w:r>
-      <w:r>
-        <w:t xml:space="preserve">,</w:t>
-      </w:r>
-      <w:r>
-        <w:t xml:space="preserve"> </w:t>
-      </w:r>
-      <w:r>
-        <w:rPr>
-          <w:rStyle w:val="VerbatimChar"/>
-        </w:rPr>
-        <w:t xml:space="preserve">summary</w:t>
-      </w:r>
-      <w:r>
-        <w:t xml:space="preserve"> </w:t>
-      </w:r>
-      <w:r>
-        <w:t xml:space="preserve">and</w:t>
-      </w:r>
-      <w:r>
-        <w:t xml:space="preserve"> </w:t>
-      </w:r>
-      <w:r>
-        <w:rPr>
-          <w:rStyle w:val="VerbatimChar"/>
-        </w:rPr>
-        <w:t xml:space="preserve">wrongIf</w:t>
-      </w:r>
-      <w:r>
-        <w:t xml:space="preserve">, and nothing</w:t>
-      </w:r>
-      <w:r>
-        <w:t xml:space="preserve"> </w:t>
-      </w:r>
-      <w:r>
-        <w:t xml:space="preserve">else. The allocator consumes</w:t>
-      </w:r>
-      <w:r>
-        <w:t xml:space="preserve"> </w:t>
-      </w:r>
-      <w:r>
-        <w:rPr>
-          <w:rStyle w:val="VerbatimChar"/>
-        </w:rPr>
-        <w:t xml:space="preserve">recommendation</w:t>
-      </w:r>
-      <w:r>
-        <w:t xml:space="preserve">,</w:t>
-      </w:r>
-      <w:r>
-        <w:t xml:space="preserve"> </w:t>
-      </w:r>
-      <w:r>
-        <w:rPr>
-          <w:rStyle w:val="VerbatimChar"/>
-        </w:rPr>
-        <w:t xml:space="preserve">thesisHealth</w:t>
-      </w:r>
-      <w:r>
-        <w:t xml:space="preserve">,</w:t>
-      </w:r>
-      <w:r>
-        <w:t xml:space="preserve"> </w:t>
-      </w:r>
-      <w:r>
-        <w:rPr>
-          <w:rStyle w:val="VerbatimChar"/>
-        </w:rPr>
-        <w:t xml:space="preserve">recommendedSize</w:t>
-      </w:r>
-      <w:r>
-        <w:t xml:space="preserve"> </w:t>
-      </w:r>
-      <w:r>
-        <w:t xml:space="preserve">and</w:t>
-      </w:r>
-      <w:r>
-        <w:t xml:space="preserve"> </w:t>
-      </w:r>
-      <w:r>
-        <w:rPr>
-          <w:rStyle w:val="VerbatimChar"/>
-        </w:rPr>
-        <w:t xml:space="preserve">capPercent</w:t>
-      </w:r>
-      <w:r>
-        <w:t xml:space="preserve">; the trend layer consumes</w:t>
-      </w:r>
-      <w:r>
-        <w:t xml:space="preserve"> </w:t>
-      </w:r>
-      <w:r>
-        <w:rPr>
-          <w:rStyle w:val="VerbatimChar"/>
-        </w:rPr>
-        <w:t xml:space="preserve">thesisHealth</w:t>
-      </w:r>
-      <w:r>
-        <w:t xml:space="preserve">,</w:t>
-      </w:r>
-      <w:r>
-        <w:t xml:space="preserve"> </w:t>
-      </w:r>
-      <w:r>
-        <w:rPr>
-          <w:rStyle w:val="VerbatimChar"/>
-        </w:rPr>
-        <w:t xml:space="preserve">credibilityDelta</w:t>
-      </w:r>
-      <w:r>
-        <w:t xml:space="preserve">,</w:t>
-      </w:r>
-      <w:r>
-        <w:t xml:space="preserve"> </w:t>
-      </w:r>
-      <w:r>
-        <w:rPr>
-          <w:rStyle w:val="VerbatimChar"/>
-        </w:rPr>
-        <w:t xml:space="preserve">mitigationCapabilityTrackRecord</w:t>
-      </w:r>
-      <w:r>
-        <w:t xml:space="preserve">,</w:t>
-      </w:r>
-      <w:r>
-        <w:t xml:space="preserve"> </w:t>
-      </w:r>
-      <w:r>
-        <w:rPr>
-          <w:rStyle w:val="VerbatimChar"/>
-        </w:rPr>
-        <w:t xml:space="preserve">freshMoneyAllocation</w:t>
-      </w:r>
-      <w:r>
-        <w:t xml:space="preserve">.</w:t>
-      </w:r>
-      <w:r>
-        <w:t xml:space="preserve"> </w:t>
-      </w:r>
-      <w:r>
-        <w:t xml:space="preserve">None of those exist in B's output. A candidate that improves the analyst's</w:t>
-      </w:r>
-      <w:r>
-        <w:t xml:space="preserve"> </w:t>
-      </w:r>
-      <w:r>
-        <w:t xml:space="preserve">signal and disconnects the layers below it has not yet been shown to improve</w:t>
-      </w:r>
-      <w:r>
-        <w:t xml:space="preserve"> </w:t>
-      </w:r>
-      <w:r>
-        <w:t xml:space="preserve">the portfolio.</w:t>
-      </w:r>
-    </w:p>
-    <w:p>
-      <w:pPr>
-        <w:pStyle w:val="BodyText"/>
-      </w:pPr>
-      <w:r>
-        <w:rPr>
-          <w:rStyle w:val="VerbatimChar"/>
-        </w:rPr>
-        <w:t xml:space="preserve">PROMOTION_GATE.md</w:t>
-      </w:r>
-      <w:r>
-        <w:t xml:space="preserve"> </w:t>
-      </w:r>
-      <w:r>
-        <w:t xml:space="preserve">§4 already says what to do:</w:t>
-      </w:r>
-      <w:r>
-        <w:t xml:space="preserve"> </w:t>
-      </w:r>
-      <w:r>
-        <w:rPr>
-          <w:b/>
-        </w:rPr>
-        <w:t xml:space="preserve">an analyst change is gated</w:t>
-      </w:r>
-      <w:r>
-        <w:rPr>
-          <w:b/>
-        </w:rPr>
-        <w:t xml:space="preserve"> </w:t>
-      </w:r>
-      <w:r>
-        <w:rPr>
-          <w:b/>
-        </w:rPr>
-        <w:t xml:space="preserve">on the analyst-direct metric and checked for no-regress on the end-to-end</w:t>
-      </w:r>
-      <w:r>
-        <w:rPr>
-          <w:b/>
-        </w:rPr>
-        <w:t xml:space="preserve"> </w:t>
-      </w:r>
-      <w:r>
-        <w:rPr>
-          <w:b/>
-        </w:rPr>
-        <w:t xml:space="preserve">portfolio metric.</w:t>
-      </w:r>
-      <w:r>
-        <w:t xml:space="preserve"> </w:t>
-      </w:r>
-      <w:r>
-        <w:t xml:space="preserve">The second half has never been run on any candidate.</w:t>
-      </w:r>
-    </w:p>
-    <w:p>
-      <w:pPr>
-        <w:pStyle w:val="BodyText"/>
-      </w:pPr>
-      <w:r>
-        <w:rPr>
-          <w:b/>
-        </w:rPr>
-        <w:t xml:space="preserve">The run, in one paragraph.</w:t>
-      </w:r>
-      <w:r>
-        <w:t xml:space="preserve"> </w:t>
-      </w:r>
-      <w:r>
-        <w:t xml:space="preserve">Score the ALL16 simulator corpus (~660</w:t>
-      </w:r>
-      <w:r>
-        <w:t xml:space="preserve"> </w:t>
-      </w:r>
-      <w:r>
-        <w:t xml:space="preserve">transcripts, on disk, the settled-configuration inputs) with B — about $16</w:t>
-      </w:r>
-      <w:r>
-        <w:t xml:space="preserve"> </w:t>
-      </w:r>
-      <w:r>
-        <w:t xml:space="preserve">at B's measured cost. Map scores to actions with the pre-registered</w:t>
-      </w:r>
-      <w:r>
-        <w:t xml:space="preserve"> </w:t>
-      </w:r>
-      <w:r>
-        <w:t xml:space="preserve">thresholds (≤ −2 Trim, ≥ +3 Add, else Hold). Run the settled configuration</w:t>
-      </w:r>
-      <w:r>
-        <w:t xml:space="preserve"> </w:t>
-      </w:r>
-      <w:r>
-        <w:t xml:space="preserve">exactly as</w:t>
-      </w:r>
-      <w:r>
-        <w:t xml:space="preserve"> </w:t>
-      </w:r>
-      <w:r>
-        <w:rPr>
-          <w:rStyle w:val="VerbatimChar"/>
-        </w:rPr>
-        <w:t xml:space="preserve">resolve-open-four</w:t>
-      </w:r>
-      <w:r>
-        <w:t xml:space="preserve"> </w:t>
-      </w:r>
-      <w:r>
-        <w:t xml:space="preserve">did, phase-averaged, daily ruler, and compare</w:t>
-      </w:r>
-      <w:r>
-        <w:t xml:space="preserve"> </w:t>
-      </w:r>
-      <w:r>
-        <w:t xml:space="preserve">final value and drawdown against</w:t>
-      </w:r>
-      <w:r>
-        <w:t xml:space="preserve"> </w:t>
-      </w:r>
-      <w:r>
-        <w:rPr>
-          <w:b/>
-        </w:rPr>
-        <w:t xml:space="preserve">$184,819 / 23.46%</w:t>
-      </w:r>
-      <w:r>
-        <w:t xml:space="preserve"> </w:t>
-      </w:r>
-      <w:r>
-        <w:t xml:space="preserve">(state of play</w:t>
-      </w:r>
-      <w:r>
-        <w:t xml:space="preserve"> </w:t>
-      </w:r>
-      <w:r>
-        <w:t xml:space="preserve">2026-09-05 §2). Also run the swapped-thresholds sensitivity (+2 bullish cut)</w:t>
-      </w:r>
-      <w:r>
-        <w:t xml:space="preserve"> </w:t>
-      </w:r>
-      <w:r>
-        <w:t xml:space="preserve">as a second cell, and report the deployment rate: fewer Adds under the +3</w:t>
-      </w:r>
-      <w:r>
-        <w:t xml:space="preserve"> </w:t>
-      </w:r>
-      <w:r>
-        <w:t xml:space="preserve">cut means slower deployment, which the 2026-09-05 document showed is the</w:t>
-      </w:r>
-      <w:r>
-        <w:t xml:space="preserve"> </w:t>
-      </w:r>
-      <w:r>
-        <w:t xml:space="preserve">mechanism that governs this allocator.</w:t>
-      </w:r>
-    </w:p>
-    <w:p>
-      <w:pPr>
-        <w:pStyle w:val="BodyText"/>
-      </w:pPr>
-      <w:r>
-        <w:rPr>
-          <w:b/>
-        </w:rPr>
-        <w:t xml:space="preserve">Pre-registered reading.</w:t>
-      </w:r>
-      <w:r>
-        <w:t xml:space="preserve"> </w:t>
-      </w:r>
-      <w:r>
-        <w:t xml:space="preserve">B's portfolio result within Rule 2's overlap of</w:t>
-      </w:r>
-      <w:r>
-        <w:t xml:space="preserve"> </w:t>
-      </w:r>
-      <w:r>
-        <w:t xml:space="preserve">v6's is a pass (no-regress); above it is a finding worth its own document;</w:t>
-      </w:r>
-      <w:r>
-        <w:t xml:space="preserve"> </w:t>
-      </w:r>
-      <w:r>
-        <w:t xml:space="preserve">below it by more than the phase spread means the score does not translate to</w:t>
-      </w:r>
-      <w:r>
-        <w:t xml:space="preserve"> </w:t>
-      </w:r>
-      <w:r>
-        <w:t xml:space="preserve">sizing under this allocator and the design question is how B's score and</w:t>
-      </w:r>
-      <w:r>
-        <w:t xml:space="preserve"> </w:t>
-      </w:r>
-      <w:r>
-        <w:t xml:space="preserve">v6's structural fields coexist — which is the next candidate either way.</w:t>
-      </w:r>
-    </w:p>
-    <w:p>
-      <w:pPr>
-        <w:pStyle w:val="BodyText"/>
-      </w:pPr>
-      <w:r>
-        <w:rPr>
-          <w:b/>
-        </w:rPr>
-        <w:t xml:space="preserve">Two things to settle in the same session, both $0:</w:t>
-      </w:r>
-    </w:p>
-    <w:p>
-      <w:pPr>
-        <w:numPr>
-          <w:ilvl w:val="0"/>
-          <w:numId w:val="1007"/>
-        </w:numPr>
-        <w:pStyle w:val="Compact"/>
-      </w:pPr>
-      <w:r>
-        <w:t xml:space="preserve">Correct the flip-count rules (§4.2 of the 09-23 document). One edit.</w:t>
-      </w:r>
-    </w:p>
-    <w:p>
-      <w:pPr>
-        <w:numPr>
-          <w:ilvl w:val="0"/>
-          <w:numId w:val="1007"/>
-        </w:numPr>
-        <w:pStyle w:val="Compact"/>
-      </w:pPr>
-      <w:r>
-        <w:t xml:space="preserve">Write the design note on which v6 fields the allocator actually needs</w:t>
-      </w:r>
-      <w:r>
-        <w:t xml:space="preserve"> </w:t>
-      </w:r>
-      <w:r>
-        <w:t xml:space="preserve">versus which it merely receives. The</w:t>
-      </w:r>
-      <w:r>
-        <w:t xml:space="preserve"> </w:t>
-      </w:r>
-      <w:r>
-        <w:rPr>
-          <w:rStyle w:val="VerbatimChar"/>
-        </w:rPr>
-        <w:t xml:space="preserve">recommendedSize</w:t>
-      </w:r>
-      <w:r>
-        <w:t xml:space="preserve"> </w:t>
-      </w:r>
-      <w:r>
-        <w:t xml:space="preserve">field is already</w:t>
-      </w:r>
-      <w:r>
-        <w:t xml:space="preserve"> </w:t>
-      </w:r>
-      <w:r>
-        <w:t xml:space="preserve">known to be inert at X=2.5pp;</w:t>
-      </w:r>
-      <w:r>
-        <w:t xml:space="preserve"> </w:t>
-      </w:r>
-      <w:r>
-        <w:rPr>
-          <w:rStyle w:val="VerbatimChar"/>
-        </w:rPr>
-        <w:t xml:space="preserve">ratchetTranche</w:t>
-      </w:r>
-      <w:r>
-        <w:t xml:space="preserve"> </w:t>
-      </w:r>
-      <w:r>
-        <w:t xml:space="preserve">is known to be</w:t>
-      </w:r>
-      <w:r>
-        <w:t xml:space="preserve"> </w:t>
-      </w:r>
-      <w:r>
-        <w:t xml:space="preserve">self-reported and unknowable per call. The list may be shorter than it</w:t>
-      </w:r>
-      <w:r>
-        <w:t xml:space="preserve"> </w:t>
-      </w:r>
-      <w:r>
-        <w:t xml:space="preserve">looks.</w:t>
-      </w:r>
-    </w:p>
-    <w:p>
-      <w:pPr>
-        <w:pStyle w:val="Heading2"/>
-      </w:pPr>
-      <w:bookmarkStart w:id="31" w:name="X2d7716d1da968b931b4d4cd85920b2d4e85154d"/>
-      <w:r>
-        <w:t xml:space="preserve">§6 Queue, after this week</w:t>
-      </w:r>
-      <w:bookmarkEnd w:id="31"/>
+        <w:t xml:space="preserve">claude-sonnet-4-6</w:t>
+      </w:r>
+      <w:r>
+        <w:t xml:space="preserve"> </w:t>
+      </w:r>
+      <w:r>
+        <w:t xml:space="preserve">(B's model) and fed through the same overlay. The</w:t>
+      </w:r>
+      <w:r>
+        <w:t xml:space="preserve"> </w:t>
+      </w:r>
+      <w:r>
+        <w:t xml:space="preserve">archived v6 verdicts (R, A0) come from a retired model and cannot serve as</w:t>
+      </w:r>
+      <w:r>
+        <w:t xml:space="preserve"> </w:t>
+      </w:r>
+      <w:r>
+        <w:t xml:space="preserve">a baseline for anything new.</w:t>
+      </w:r>
     </w:p>
     <w:tbl>
       <w:tblPr>
@@ -3083,7 +2474,7 @@
               <w:jc w:val="left"/>
             </w:pPr>
             <w:r>
-              <w:t xml:space="preserve">#</w:t>
+              <w:t xml:space="preserve">cell</w:t>
             </w:r>
           </w:p>
         </w:tc>
@@ -3100,7 +2491,7 @@
               <w:jc w:val="left"/>
             </w:pPr>
             <w:r>
-              <w:t xml:space="preserve">candidate</w:t>
+              <w:t xml:space="preserve">what it is</w:t>
             </w:r>
           </w:p>
         </w:tc>
@@ -3117,24 +2508,51 @@
               <w:jc w:val="left"/>
             </w:pPr>
             <w:r>
-              <w:t xml:space="preserve">status</w:t>
-            </w:r>
-          </w:p>
-        </w:tc>
-      </w:tr>
-      <w:tr>
-        <w:tc>
-          <w:p>
-            <w:pPr>
-              <w:pStyle w:val="Compact"/>
-              <w:jc w:val="left"/>
-            </w:pPr>
-            <w:r>
-              <w:t xml:space="preserve">—</w:t>
-            </w:r>
-          </w:p>
-        </w:tc>
-        <w:tc>
+              <w:t xml:space="preserve">final value</w:t>
+            </w:r>
+          </w:p>
+        </w:tc>
+        <w:tc>
+          <w:tcPr>
+            <w:tcBorders>
+              <w:bottom w:val="single"/>
+            </w:tcBorders>
+            <w:vAlign w:val="bottom"/>
+          </w:tcPr>
+          <w:p>
+            <w:pPr>
+              <w:pStyle w:val="Compact"/>
+              <w:jc w:val="left"/>
+            </w:pPr>
+            <w:r>
+              <w:t xml:space="preserve">phase range</w:t>
+            </w:r>
+          </w:p>
+        </w:tc>
+        <w:tc>
+          <w:tcPr>
+            <w:tcBorders>
+              <w:bottom w:val="single"/>
+            </w:tcBorders>
+            <w:vAlign w:val="bottom"/>
+          </w:tcPr>
+          <w:p>
+            <w:pPr>
+              <w:pStyle w:val="Compact"/>
+              <w:jc w:val="left"/>
+            </w:pPr>
+            <w:r>
+              <w:t xml:space="preserve">drawdown, daily</w:t>
+            </w:r>
+          </w:p>
+        </w:tc>
+        <w:tc>
+          <w:tcPr>
+            <w:tcBorders>
+              <w:bottom w:val="single"/>
+            </w:tcBorders>
+            <w:vAlign w:val="bottom"/>
+          </w:tcPr>
           <w:p>
             <w:pPr>
               <w:pStyle w:val="Compact"/>
@@ -3144,16 +2562,148 @@
               <w:rPr>
                 <w:b/>
               </w:rPr>
-              <w:t xml:space="preserve">B end-to-end check</w:t>
-            </w:r>
-            <w:r>
-              <w:t xml:space="preserve"> </w:t>
-            </w:r>
-            <w:r>
-              <w:t xml:space="preserve">(§5)</w:t>
-            </w:r>
-          </w:p>
-        </w:tc>
+              <w:t xml:space="preserve">gain per point of drawdown</w:t>
+            </w:r>
+          </w:p>
+        </w:tc>
+      </w:tr>
+      <w:tr>
+        <w:tc>
+          <w:p>
+            <w:pPr>
+              <w:pStyle w:val="Compact"/>
+              <w:jc w:val="left"/>
+            </w:pPr>
+            <w:r>
+              <w:t xml:space="preserve">R</w:t>
+            </w:r>
+          </w:p>
+        </w:tc>
+        <w:tc>
+          <w:p>
+            <w:pPr>
+              <w:pStyle w:val="Compact"/>
+              <w:jc w:val="left"/>
+            </w:pPr>
+            <w:r>
+              <w:t xml:space="preserve">v6 archive, the published reference</w:t>
+            </w:r>
+          </w:p>
+        </w:tc>
+        <w:tc>
+          <w:p>
+            <w:pPr>
+              <w:pStyle w:val="Compact"/>
+              <w:jc w:val="left"/>
+            </w:pPr>
+            <w:r>
+              <w:t xml:space="preserve">$184,819</w:t>
+            </w:r>
+          </w:p>
+        </w:tc>
+        <w:tc>
+          <w:p>
+            <w:pPr>
+              <w:pStyle w:val="Compact"/>
+              <w:jc w:val="left"/>
+            </w:pPr>
+            <w:r>
+              <w:t xml:space="preserve">$179,945–$189,914</w:t>
+            </w:r>
+          </w:p>
+        </w:tc>
+        <w:tc>
+          <w:p>
+            <w:pPr>
+              <w:pStyle w:val="Compact"/>
+              <w:jc w:val="left"/>
+            </w:pPr>
+            <w:r>
+              <w:t xml:space="preserve">23.46%</w:t>
+            </w:r>
+          </w:p>
+        </w:tc>
+        <w:tc>
+          <w:p>
+            <w:pPr>
+              <w:pStyle w:val="Compact"/>
+              <w:jc w:val="left"/>
+            </w:pPr>
+            <w:r>
+              <w:t xml:space="preserve">$3,616</w:t>
+            </w:r>
+          </w:p>
+        </w:tc>
+      </w:tr>
+      <w:tr>
+        <w:tc>
+          <w:p>
+            <w:pPr>
+              <w:pStyle w:val="Compact"/>
+              <w:jc w:val="left"/>
+            </w:pPr>
+            <w:r>
+              <w:t xml:space="preserve">A0</w:t>
+            </w:r>
+          </w:p>
+        </w:tc>
+        <w:tc>
+          <w:p>
+            <w:pPr>
+              <w:pStyle w:val="Compact"/>
+              <w:jc w:val="left"/>
+            </w:pPr>
+            <w:r>
+              <w:t xml:space="preserve">v6 archive through the overlay</w:t>
+            </w:r>
+          </w:p>
+        </w:tc>
+        <w:tc>
+          <w:p>
+            <w:pPr>
+              <w:pStyle w:val="Compact"/>
+              <w:jc w:val="left"/>
+            </w:pPr>
+            <w:r>
+              <w:t xml:space="preserve">$183,780</w:t>
+            </w:r>
+          </w:p>
+        </w:tc>
+        <w:tc>
+          <w:p>
+            <w:pPr>
+              <w:pStyle w:val="Compact"/>
+              <w:jc w:val="left"/>
+            </w:pPr>
+            <w:r>
+              <w:t xml:space="preserve">$175,269–$192,981</w:t>
+            </w:r>
+          </w:p>
+        </w:tc>
+        <w:tc>
+          <w:p>
+            <w:pPr>
+              <w:pStyle w:val="Compact"/>
+              <w:jc w:val="left"/>
+            </w:pPr>
+            <w:r>
+              <w:t xml:space="preserve">23.91%</w:t>
+            </w:r>
+          </w:p>
+        </w:tc>
+        <w:tc>
+          <w:p>
+            <w:pPr>
+              <w:pStyle w:val="Compact"/>
+              <w:jc w:val="left"/>
+            </w:pPr>
+            <w:r>
+              <w:t xml:space="preserve">$3,504</w:t>
+            </w:r>
+          </w:p>
+        </w:tc>
+      </w:tr>
+      <w:tr>
         <w:tc>
           <w:p>
             <w:pPr>
@@ -3164,7 +2714,74 @@
               <w:rPr>
                 <w:b/>
               </w:rPr>
-              <w:t xml:space="preserve">next, ~$16</w:t>
+              <w:t xml:space="preserve">A0′</w:t>
+            </w:r>
+          </w:p>
+        </w:tc>
+        <w:tc>
+          <w:p>
+            <w:pPr>
+              <w:pStyle w:val="Compact"/>
+              <w:jc w:val="left"/>
+            </w:pPr>
+            <w:r>
+              <w:rPr>
+                <w:b/>
+              </w:rPr>
+              <w:t xml:space="preserve">v6 on sonnet-4-6 through the overlay — the comparator</w:t>
+            </w:r>
+          </w:p>
+        </w:tc>
+        <w:tc>
+          <w:p>
+            <w:pPr>
+              <w:pStyle w:val="Compact"/>
+              <w:jc w:val="left"/>
+            </w:pPr>
+            <w:r>
+              <w:rPr>
+                <w:b/>
+              </w:rPr>
+              <w:t xml:space="preserve">$200,214</w:t>
+            </w:r>
+          </w:p>
+        </w:tc>
+        <w:tc>
+          <w:p>
+            <w:pPr>
+              <w:pStyle w:val="Compact"/>
+              <w:jc w:val="left"/>
+            </w:pPr>
+            <w:r>
+              <w:t xml:space="preserve">$194,407–$206,925</w:t>
+            </w:r>
+          </w:p>
+        </w:tc>
+        <w:tc>
+          <w:p>
+            <w:pPr>
+              <w:pStyle w:val="Compact"/>
+              <w:jc w:val="left"/>
+            </w:pPr>
+            <w:r>
+              <w:rPr>
+                <w:b/>
+              </w:rPr>
+              <w:t xml:space="preserve">20.12%</w:t>
+            </w:r>
+          </w:p>
+        </w:tc>
+        <w:tc>
+          <w:p>
+            <w:pPr>
+              <w:pStyle w:val="Compact"/>
+              <w:jc w:val="left"/>
+            </w:pPr>
+            <w:r>
+              <w:rPr>
+                <w:b/>
+              </w:rPr>
+              <w:t xml:space="preserve">$4,981</w:t>
             </w:r>
           </w:p>
         </w:tc>
@@ -3177,29 +2794,77 @@
               <w:jc w:val="left"/>
             </w:pPr>
             <w:r>
-              <w:t xml:space="preserve">P6D</w:t>
-            </w:r>
-          </w:p>
-        </w:tc>
-        <w:tc>
-          <w:p>
-            <w:pPr>
-              <w:pStyle w:val="Compact"/>
-              <w:jc w:val="left"/>
-            </w:pPr>
-            <w:r>
-              <w:t xml:space="preserve">B plus only the structured fields the allocator needs, tested for no change in rank correlation</w:t>
-            </w:r>
-          </w:p>
-        </w:tc>
-        <w:tc>
-          <w:p>
-            <w:pPr>
-              <w:pStyle w:val="Compact"/>
-              <w:jc w:val="left"/>
-            </w:pPr>
-            <w:r>
-              <w:t xml:space="preserve">named; depends on the §5 design note</w:t>
+              <w:rPr>
+                <w:b/>
+              </w:rPr>
+              <w:t xml:space="preserve">B3</w:t>
+            </w:r>
+          </w:p>
+        </w:tc>
+        <w:tc>
+          <w:p>
+            <w:pPr>
+              <w:pStyle w:val="Compact"/>
+              <w:jc w:val="left"/>
+            </w:pPr>
+            <w:r>
+              <w:rPr>
+                <w:b/>
+              </w:rPr>
+              <w:t xml:space="preserve">B's score, ≤ −2 Trim / ≥ +3 Add / else Hold</w:t>
+            </w:r>
+          </w:p>
+        </w:tc>
+        <w:tc>
+          <w:p>
+            <w:pPr>
+              <w:pStyle w:val="Compact"/>
+              <w:jc w:val="left"/>
+            </w:pPr>
+            <w:r>
+              <w:rPr>
+                <w:b/>
+              </w:rPr>
+              <w:t xml:space="preserve">$210,351</w:t>
+            </w:r>
+          </w:p>
+        </w:tc>
+        <w:tc>
+          <w:p>
+            <w:pPr>
+              <w:pStyle w:val="Compact"/>
+              <w:jc w:val="left"/>
+            </w:pPr>
+            <w:r>
+              <w:t xml:space="preserve">$207,495–$214,227</w:t>
+            </w:r>
+          </w:p>
+        </w:tc>
+        <w:tc>
+          <w:p>
+            <w:pPr>
+              <w:pStyle w:val="Compact"/>
+              <w:jc w:val="left"/>
+            </w:pPr>
+            <w:r>
+              <w:rPr>
+                <w:b/>
+              </w:rPr>
+              <w:t xml:space="preserve">16.97%</w:t>
+            </w:r>
+          </w:p>
+        </w:tc>
+        <w:tc>
+          <w:p>
+            <w:pPr>
+              <w:pStyle w:val="Compact"/>
+              <w:jc w:val="left"/>
+            </w:pPr>
+            <w:r>
+              <w:rPr>
+                <w:b/>
+              </w:rPr>
+              <w:t xml:space="preserve">$6,503</w:t>
             </w:r>
           </w:p>
         </w:tc>
@@ -3212,29 +2877,1382 @@
               <w:jc w:val="left"/>
             </w:pPr>
             <w:r>
-              <w:t xml:space="preserve">P7</w:t>
-            </w:r>
-          </w:p>
-        </w:tc>
-        <w:tc>
-          <w:p>
-            <w:pPr>
-              <w:pStyle w:val="Compact"/>
-              <w:jc w:val="left"/>
-            </w:pPr>
-            <w:r>
-              <w:t xml:space="preserve">three-voices rubric, from B</w:t>
-            </w:r>
-          </w:p>
-        </w:tc>
-        <w:tc>
-          <w:p>
-            <w:pPr>
-              <w:pStyle w:val="Compact"/>
-              <w:jc w:val="left"/>
-            </w:pPr>
-            <w:r>
-              <w:t xml:space="preserve">named, not run</w:t>
+              <w:t xml:space="preserve">B2</w:t>
+            </w:r>
+          </w:p>
+        </w:tc>
+        <w:tc>
+          <w:p>
+            <w:pPr>
+              <w:pStyle w:val="Compact"/>
+              <w:jc w:val="left"/>
+            </w:pPr>
+            <w:r>
+              <w:t xml:space="preserve">B's score, Add cut at +2</w:t>
+            </w:r>
+          </w:p>
+        </w:tc>
+        <w:tc>
+          <w:p>
+            <w:pPr>
+              <w:pStyle w:val="Compact"/>
+              <w:jc w:val="left"/>
+            </w:pPr>
+            <w:r>
+              <w:t xml:space="preserve">$242,415</w:t>
+            </w:r>
+          </w:p>
+        </w:tc>
+        <w:tc>
+          <w:p>
+            <w:pPr>
+              <w:pStyle w:val="Compact"/>
+              <w:jc w:val="left"/>
+            </w:pPr>
+            <w:r>
+              <w:t xml:space="preserve">$237,175–$249,799</w:t>
+            </w:r>
+          </w:p>
+        </w:tc>
+        <w:tc>
+          <w:p>
+            <w:pPr>
+              <w:pStyle w:val="Compact"/>
+              <w:jc w:val="left"/>
+            </w:pPr>
+            <w:r>
+              <w:t xml:space="preserve">19.77%</w:t>
+            </w:r>
+          </w:p>
+        </w:tc>
+        <w:tc>
+          <w:p>
+            <w:pPr>
+              <w:pStyle w:val="Compact"/>
+              <w:jc w:val="left"/>
+            </w:pPr>
+            <w:r>
+              <w:t xml:space="preserve">$7,204</w:t>
+            </w:r>
+          </w:p>
+        </w:tc>
+      </w:tr>
+    </w:tbl>
+    <w:p>
+      <w:pPr>
+        <w:pStyle w:val="BodyText"/>
+      </w:pPr>
+      <w:r>
+        <w:t xml:space="preserve">"Gain per point of drawdown" is</w:t>
+      </w:r>
+      <w:r>
+        <w:t xml:space="preserve"> </w:t>
+      </w:r>
+      <w:r>
+        <w:rPr>
+          <w:rStyle w:val="VerbatimChar"/>
+        </w:rPr>
+        <w:t xml:space="preserve">PROMOTION_GATE.md</w:t>
+      </w:r>
+      <w:r>
+        <w:t xml:space="preserve"> </w:t>
+      </w:r>
+      <w:r>
+        <w:t xml:space="preserve">§3.2's end-to-end</w:t>
+      </w:r>
+      <w:r>
+        <w:t xml:space="preserve"> </w:t>
+      </w:r>
+      <w:r>
+        <w:t xml:space="preserve">metric — return per unit of max drawdown, locked 2026-05-23 — computed here</w:t>
+      </w:r>
+      <w:r>
+        <w:t xml:space="preserve"> </w:t>
+      </w:r>
+      <w:r>
+        <w:t xml:space="preserve">as (final − $100,000) ÷ daily-marked drawdown.</w:t>
+      </w:r>
+      <w:r>
+        <w:t xml:space="preserve"> </w:t>
+      </w:r>
+      <w:r>
+        <w:rPr>
+          <w:b/>
+        </w:rPr>
+        <w:t xml:space="preserve">It was not in the run's</w:t>
+      </w:r>
+      <w:r>
+        <w:rPr>
+          <w:b/>
+        </w:rPr>
+        <w:t xml:space="preserve"> </w:t>
+      </w:r>
+      <w:r>
+        <w:rPr>
+          <w:b/>
+        </w:rPr>
+        <w:t xml:space="preserve">pre-registration</w:t>
+      </w:r>
+      <w:r>
+        <w:t xml:space="preserve">, which used final-value phase ranges; it is stated here</w:t>
+      </w:r>
+      <w:r>
+        <w:t xml:space="preserve"> </w:t>
+      </w:r>
+      <w:r>
+        <w:t xml:space="preserve">because it is the metric the gate names, and the omission was mine.</w:t>
+      </w:r>
+    </w:p>
+    <w:p>
+      <w:pPr>
+        <w:pStyle w:val="BodyText"/>
+      </w:pPr>
+      <w:r>
+        <w:rPr>
+          <w:b/>
+        </w:rPr>
+        <w:t xml:space="preserve">The split of the original $26,570.</w:t>
+      </w:r>
+      <w:r>
+        <w:t xml:space="preserve"> </w:t>
+      </w:r>
+      <w:r>
+        <w:t xml:space="preserve">A0′ − A0 =</w:t>
+      </w:r>
+      <w:r>
+        <w:t xml:space="preserve"> </w:t>
+      </w:r>
+      <w:r>
+        <w:rPr>
+          <w:b/>
+        </w:rPr>
+        <w:t xml:space="preserve">$16,433 is the model</w:t>
+      </w:r>
+      <w:r>
+        <w:t xml:space="preserve"> </w:t>
+      </w:r>
+      <w:r>
+        <w:t xml:space="preserve">(62%); B3 − A0′ =</w:t>
+      </w:r>
+      <w:r>
+        <w:t xml:space="preserve"> </w:t>
+      </w:r>
+      <w:r>
+        <w:rPr>
+          <w:b/>
+        </w:rPr>
+        <w:t xml:space="preserve">$10,137 is the prompt</w:t>
+      </w:r>
+      <w:r>
+        <w:t xml:space="preserve"> </w:t>
+      </w:r>
+      <w:r>
+        <w:t xml:space="preserve">(38%). On final value B3 is</w:t>
+      </w:r>
+      <w:r>
+        <w:t xml:space="preserve"> </w:t>
+      </w:r>
+      <w:r>
+        <w:t xml:space="preserve">formally above A0′'s phase range, by $569 at the closest phases — a thin</w:t>
+      </w:r>
+      <w:r>
+        <w:t xml:space="preserve"> </w:t>
+      </w:r>
+      <w:r>
+        <w:t xml:space="preserve">margin.</w:t>
+      </w:r>
+    </w:p>
+    <w:p>
+      <w:pPr>
+        <w:pStyle w:val="BodyText"/>
+      </w:pPr>
+      <w:r>
+        <w:rPr>
+          <w:b/>
+        </w:rPr>
+        <w:t xml:space="preserve">Leave-one-ticker-out, sixteen cuts.</w:t>
+      </w:r>
+      <w:r>
+        <w:t xml:space="preserve"> </w:t>
+      </w:r>
+      <w:r>
+        <w:t xml:space="preserve">On final value the B3 − A0′ gap</w:t>
+      </w:r>
+      <w:r>
+        <w:t xml:space="preserve"> </w:t>
+      </w:r>
+      <w:r>
+        <w:t xml:space="preserve">stays positive in 15 of 16 and</w:t>
+      </w:r>
+      <w:r>
+        <w:t xml:space="preserve"> </w:t>
+      </w:r>
+      <w:r>
+        <w:rPr>
+          <w:b/>
+        </w:rPr>
+        <w:t xml:space="preserve">flips to −$2,279 without FSLR</w:t>
+      </w:r>
+      <w:r>
+        <w:t xml:space="preserve">; without</w:t>
+      </w:r>
+      <w:r>
+        <w:t xml:space="preserve"> </w:t>
+      </w:r>
+      <w:r>
+        <w:t xml:space="preserve">NVDA it is +$2,366.</w:t>
+      </w:r>
+      <w:r>
+        <w:t xml:space="preserve"> </w:t>
+      </w:r>
+      <w:r>
+        <w:rPr>
+          <w:b/>
+        </w:rPr>
+        <w:t xml:space="preserve">On daily drawdown B3 is better than A0′ in all</w:t>
+      </w:r>
+      <w:r>
+        <w:rPr>
+          <w:b/>
+        </w:rPr>
+        <w:t xml:space="preserve"> </w:t>
+      </w:r>
+      <w:r>
+        <w:rPr>
+          <w:b/>
+        </w:rPr>
+        <w:t xml:space="preserve">sixteen</w:t>
+      </w:r>
+      <w:r>
+        <w:t xml:space="preserve"> </w:t>
+      </w:r>
+      <w:r>
+        <w:t xml:space="preserve">(15–17% against 19–21%).</w:t>
+      </w:r>
+      <w:r>
+        <w:t xml:space="preserve"> </w:t>
+      </w:r>
+      <w:r>
+        <w:rPr>
+          <w:b/>
+        </w:rPr>
+        <w:t xml:space="preserve">On gain per point of drawdown B3 is</w:t>
+      </w:r>
+      <w:r>
+        <w:rPr>
+          <w:b/>
+        </w:rPr>
+        <w:t xml:space="preserve"> </w:t>
+      </w:r>
+      <w:r>
+        <w:rPr>
+          <w:b/>
+        </w:rPr>
+        <w:t xml:space="preserve">ahead in all sixteen</w:t>
+      </w:r>
+      <w:r>
+        <w:t xml:space="preserve">: without FSLR $5,901 vs $4,783; without NVDA $4,120</w:t>
+      </w:r>
+      <w:r>
+        <w:t xml:space="preserve"> </w:t>
+      </w:r>
+      <w:r>
+        <w:t xml:space="preserve">vs $3,054.</w:t>
+      </w:r>
+    </w:p>
+    <w:p>
+      <w:pPr>
+        <w:pStyle w:val="BodyText"/>
+      </w:pPr>
+      <w:r>
+        <w:rPr>
+          <w:b/>
+        </w:rPr>
+        <w:t xml:space="preserve">Reading.</w:t>
+      </w:r>
+      <w:r>
+        <w:t xml:space="preserve"> </w:t>
+      </w:r>
+      <w:r>
+        <w:t xml:space="preserve">On final value, B and v6-on-the-same-model are close to a tie,</w:t>
+      </w:r>
+      <w:r>
+        <w:t xml:space="preserve"> </w:t>
+      </w:r>
+      <w:r>
+        <w:t xml:space="preserve">and the tie depends on one name. On risk, B wins in every cut. On the</w:t>
+      </w:r>
+      <w:r>
+        <w:t xml:space="preserve"> </w:t>
+      </w:r>
+      <w:r>
+        <w:t xml:space="preserve">gate's own end-to-end metric, B is ~30% better and never behind. The</w:t>
+      </w:r>
+      <w:r>
+        <w:t xml:space="preserve"> </w:t>
+      </w:r>
+      <w:r>
+        <w:t xml:space="preserve">mechanism is the one the first end-to-end run showed: B's 45 Trims landed</w:t>
+      </w:r>
+      <w:r>
+        <w:t xml:space="preserve"> </w:t>
+      </w:r>
+      <w:r>
+        <w:t xml:space="preserve">on stocks that fell a median 24% (v6's: −6%), 35 of them speculatives; B</w:t>
+      </w:r>
+      <w:r>
+        <w:t xml:space="preserve"> </w:t>
+      </w:r>
+      <w:r>
+        <w:t xml:space="preserve">made 7 speculative Adds (median +24%) where v6 made 29 (median −14%). B</w:t>
+      </w:r>
+      <w:r>
+        <w:t xml:space="preserve"> </w:t>
+      </w:r>
+      <w:r>
+        <w:t xml:space="preserve">deploys more slowly — 61 funded Adds vs 97, 34% average cash — and is paid</w:t>
+      </w:r>
+      <w:r>
+        <w:t xml:space="preserve"> </w:t>
+      </w:r>
+      <w:r>
+        <w:t xml:space="preserve">for it in drawdown.</w:t>
+      </w:r>
+    </w:p>
+    <w:p>
+      <w:pPr>
+        <w:pStyle w:val="BodyText"/>
+      </w:pPr>
+      <w:r>
+        <w:rPr>
+          <w:b/>
+        </w:rPr>
+        <w:t xml:space="preserve">Two findings that change the design.</w:t>
+      </w:r>
+      <w:r>
+        <w:t xml:space="preserve"> </w:t>
+      </w:r>
+      <w:r>
+        <w:t xml:space="preserve">The trend layer is worth</w:t>
+      </w:r>
+      <w:r>
+        <w:t xml:space="preserve"> </w:t>
+      </w:r>
+      <w:r>
+        <w:rPr>
+          <w:b/>
+        </w:rPr>
+        <w:t xml:space="preserve">+$1,039</w:t>
+      </w:r>
+      <w:r>
+        <w:t xml:space="preserve"> </w:t>
+      </w:r>
+      <w:r>
+        <w:t xml:space="preserve">on this corpus (R minus A0), inside R's own phase spread.</w:t>
+      </w:r>
+      <w:r>
+        <w:t xml:space="preserve"> </w:t>
+      </w:r>
+      <w:r>
+        <w:rPr>
+          <w:rStyle w:val="VerbatimChar"/>
+        </w:rPr>
+        <w:t xml:space="preserve">recommended_size</w:t>
+      </w:r>
+      <w:r>
+        <w:t xml:space="preserve"> </w:t>
+      </w:r>
+      <w:r>
+        <w:t xml:space="preserve">was null in every overlaid cell at no visible cost.</w:t>
+      </w:r>
+    </w:p>
+    <w:p>
+      <w:pPr>
+        <w:pStyle w:val="BodyText"/>
+      </w:pPr>
+      <w:r>
+        <w:rPr>
+          <w:b/>
+        </w:rPr>
+        <w:t xml:space="preserve">Two things noted, not concluded.</w:t>
+      </w:r>
+      <w:r>
+        <w:t xml:space="preserve"> </w:t>
+      </w:r>
+      <w:r>
+        <w:t xml:space="preserve">v6 on the newer model is itself worth</w:t>
+      </w:r>
+      <w:r>
+        <w:t xml:space="preserve"> </w:t>
+      </w:r>
+      <w:r>
+        <w:t xml:space="preserve">$16k on this window; both models post-date the window, so the run cannot</w:t>
+      </w:r>
+      <w:r>
+        <w:t xml:space="preserve"> </w:t>
+      </w:r>
+      <w:r>
+        <w:t xml:space="preserve">separate "reads calls better" from recall the older model lacked, and the</w:t>
+      </w:r>
+      <w:r>
+        <w:t xml:space="preserve"> </w:t>
+      </w:r>
+      <w:r>
+        <w:t xml:space="preserve">same caveat covers B. And FSLR — the diagnostic case in the 2026-09-05</w:t>
+      </w:r>
+      <w:r>
+        <w:t xml:space="preserve"> </w:t>
+      </w:r>
+      <w:r>
+        <w:t xml:space="preserve">winners-runway thread, the name the allocator sized wrong — is the name B</w:t>
+      </w:r>
+      <w:r>
+        <w:t xml:space="preserve"> </w:t>
+      </w:r>
+      <w:r>
+        <w:t xml:space="preserve">sized right ($23.5k held at the end vs A0′'s $12.5k). One name; a note.</w:t>
+      </w:r>
+    </w:p>
+    <w:p>
+      <w:pPr>
+        <w:pStyle w:val="BodyText"/>
+      </w:pPr>
+      <w:r>
+        <w:rPr>
+          <w:b/>
+        </w:rPr>
+        <w:t xml:space="preserve">What it does not show.</w:t>
+      </w:r>
+      <w:r>
+        <w:t xml:space="preserve"> </w:t>
+      </w:r>
+      <w:r>
+        <w:t xml:space="preserve">One window, one seed family; the band is the</w:t>
+      </w:r>
+      <w:r>
+        <w:t xml:space="preserve"> </w:t>
+      </w:r>
+      <w:r>
+        <w:t xml:space="preserve">phase spread. Recall is the documented limitation of</w:t>
+      </w:r>
+      <w:r>
+        <w:t xml:space="preserve"> </w:t>
+      </w:r>
+      <w:r>
+        <w:rPr>
+          <w:rStyle w:val="VerbatimChar"/>
+        </w:rPr>
+        <w:t xml:space="preserve">DESIGN_PRINCIPLES.md</w:t>
+      </w:r>
+      <w:r>
+        <w:t xml:space="preserve"> </w:t>
+      </w:r>
+      <w:r>
+        <w:t xml:space="preserve">§4 and applies to every cell equally.</w:t>
+      </w:r>
+      <w:r>
+        <w:t xml:space="preserve"> </w:t>
+      </w:r>
+      <w:r>
+        <w:rPr>
+          <w:b/>
+        </w:rPr>
+        <w:t xml:space="preserve">The</w:t>
+      </w:r>
+      <w:r>
+        <w:rPr>
+          <w:b/>
+        </w:rPr>
+        <w:t xml:space="preserve"> </w:t>
+      </w:r>
+      <w:r>
+        <w:rPr>
+          <w:b/>
+        </w:rPr>
+        <w:t xml:space="preserve">analyst-direct evidence (§2.1–2.3) is untouched by the correction</w:t>
+      </w:r>
+      <w:r>
+        <w:t xml:space="preserve">: train,</w:t>
+      </w:r>
+      <w:r>
+        <w:t xml:space="preserve"> </w:t>
+      </w:r>
+      <w:r>
+        <w:t xml:space="preserve">tune and pooled v6 baselines were already scored on</w:t>
+      </w:r>
+      <w:r>
+        <w:t xml:space="preserve"> </w:t>
+      </w:r>
+      <w:r>
+        <w:rPr>
+          <w:rStyle w:val="VerbatimChar"/>
+        </w:rPr>
+        <w:t xml:space="preserve">claude-sonnet-4-6</w:t>
+      </w:r>
+      <w:r>
+        <w:t xml:space="preserve">;</w:t>
+      </w:r>
+      <w:r>
+        <w:t xml:space="preserve"> </w:t>
+      </w:r>
+      <w:r>
+        <w:t xml:space="preserve">the confound existed only on the simulator corpus.</w:t>
+      </w:r>
+    </w:p>
+    <w:p>
+      <w:pPr>
+        <w:pStyle w:val="Heading2"/>
+      </w:pPr>
+      <w:bookmarkStart w:id="29" w:name="X19eafd7a445ba4554cd7d51fe7cf387343551c3"/>
+      <w:r>
+        <w:t xml:space="preserve">§3 What this changes</w:t>
+      </w:r>
+      <w:bookmarkEnd w:id="29"/>
+    </w:p>
+    <w:p>
+      <w:pPr>
+        <w:numPr>
+          <w:ilvl w:val="0"/>
+          <w:numId w:val="1005"/>
+        </w:numPr>
+        <w:pStyle w:val="Compact"/>
+      </w:pPr>
+      <w:r>
+        <w:rPr>
+          <w:b/>
+        </w:rPr>
+        <w:t xml:space="preserve">The working analyst candidate is the minimal prompt.</w:t>
+      </w:r>
+      <w:r>
+        <w:t xml:space="preserve"> </w:t>
+      </w:r>
+      <w:r>
+        <w:rPr>
+          <w:rStyle w:val="VerbatimChar"/>
+        </w:rPr>
+        <w:t xml:space="preserve">P6B-minimal</w:t>
+      </w:r>
+      <w:r>
+        <w:t xml:space="preserve">,</w:t>
+      </w:r>
+      <w:r>
+        <w:t xml:space="preserve"> </w:t>
+      </w:r>
+      <w:r>
+        <w:t xml:space="preserve">sha</w:t>
+      </w:r>
+      <w:r>
+        <w:t xml:space="preserve"> </w:t>
+      </w:r>
+      <w:r>
+        <w:rPr>
+          <w:rStyle w:val="VerbatimChar"/>
+        </w:rPr>
+        <w:t xml:space="preserve">d1fa5e53…</w:t>
+      </w:r>
+      <w:r>
+        <w:t xml:space="preserve">, registered as a candidate in</w:t>
+      </w:r>
+      <w:r>
+        <w:t xml:space="preserve"> </w:t>
+      </w:r>
+      <w:r>
+        <w:rPr>
+          <w:rStyle w:val="VerbatimChar"/>
+        </w:rPr>
+        <w:t xml:space="preserve">VERSION_REGISTRY.json</w:t>
+      </w:r>
+      <w:r>
+        <w:t xml:space="preserve">.</w:t>
+      </w:r>
+      <w:r>
+        <w:t xml:space="preserve"> </w:t>
+      </w:r>
+      <w:r>
+        <w:t xml:space="preserve">Not promoted; see §5. It has cleared both halves of the gate's test</w:t>
+      </w:r>
+      <w:r>
+        <w:t xml:space="preserve"> </w:t>
+      </w:r>
+      <w:r>
+        <w:t xml:space="preserve">for an analyst change (</w:t>
+      </w:r>
+      <w:r>
+        <w:rPr>
+          <w:rStyle w:val="VerbatimChar"/>
+        </w:rPr>
+        <w:t xml:space="preserve">PROMOTION_GATE.md</w:t>
+      </w:r>
+      <w:r>
+        <w:t xml:space="preserve"> </w:t>
+      </w:r>
+      <w:r>
+        <w:t xml:space="preserve">§4): PROMOTE on the</w:t>
+      </w:r>
+      <w:r>
+        <w:t xml:space="preserve"> </w:t>
+      </w:r>
+      <w:r>
+        <w:t xml:space="preserve">analyst-direct metric on two splits, and no regression — an</w:t>
+      </w:r>
+      <w:r>
+        <w:t xml:space="preserve"> </w:t>
+      </w:r>
+      <w:r>
+        <w:t xml:space="preserve">improvement — on the end-to-end metric against the same-model</w:t>
+      </w:r>
+      <w:r>
+        <w:t xml:space="preserve"> </w:t>
+      </w:r>
+      <w:r>
+        <w:t xml:space="preserve">comparator.</w:t>
+      </w:r>
+    </w:p>
+    <w:p>
+      <w:pPr>
+        <w:numPr>
+          <w:ilvl w:val="0"/>
+          <w:numId w:val="1005"/>
+        </w:numPr>
+        <w:pStyle w:val="Compact"/>
+      </w:pPr>
+      <w:r>
+        <w:rPr>
+          <w:b/>
+        </w:rPr>
+        <w:t xml:space="preserve">P7 and P8 iterate from B, not from v6.</w:t>
+      </w:r>
+      <w:r>
+        <w:t xml:space="preserve"> </w:t>
+      </w:r>
+      <w:r>
+        <w:t xml:space="preserve">Fifty lines is the starting</w:t>
+      </w:r>
+      <w:r>
+        <w:t xml:space="preserve"> </w:t>
+      </w:r>
+      <w:r>
+        <w:t xml:space="preserve">point. Any future rubric must earn its length against this control.</w:t>
+      </w:r>
+    </w:p>
+    <w:p>
+      <w:pPr>
+        <w:numPr>
+          <w:ilvl w:val="0"/>
+          <w:numId w:val="1005"/>
+        </w:numPr>
+        <w:pStyle w:val="Compact"/>
+      </w:pPr>
+      <w:r>
+        <w:rPr>
+          <w:b/>
+        </w:rPr>
+        <w:t xml:space="preserve">P1 is closed.</w:t>
+      </w:r>
+      <w:r>
+        <w:t xml:space="preserve"> </w:t>
+      </w:r>
+      <w:r>
+        <w:t xml:space="preserve">It pushed v6 toward bearish by lowering the evidence</w:t>
+      </w:r>
+      <w:r>
+        <w:t xml:space="preserve"> </w:t>
+      </w:r>
+      <w:r>
+        <w:t xml:space="preserve">bar; B reaches the same coverage by changing the output format, without</w:t>
+      </w:r>
+      <w:r>
+        <w:t xml:space="preserve"> </w:t>
+      </w:r>
+      <w:r>
+        <w:t xml:space="preserve">the precision loss P1 predicted for itself.</w:t>
+      </w:r>
+    </w:p>
+    <w:p>
+      <w:pPr>
+        <w:numPr>
+          <w:ilvl w:val="0"/>
+          <w:numId w:val="1005"/>
+        </w:numPr>
+        <w:pStyle w:val="Compact"/>
+      </w:pPr>
+      <w:r>
+        <w:rPr>
+          <w:b/>
+        </w:rPr>
+        <w:t xml:space="preserve">Arm C is closed</w:t>
+      </w:r>
+      <w:r>
+        <w:t xml:space="preserve"> </w:t>
+      </w:r>
+      <w:r>
+        <w:t xml:space="preserve">on train evidence: same signal as B at 66% more cost.</w:t>
+      </w:r>
+    </w:p>
+    <w:p>
+      <w:pPr>
+        <w:numPr>
+          <w:ilvl w:val="0"/>
+          <w:numId w:val="1005"/>
+        </w:numPr>
+        <w:pStyle w:val="Compact"/>
+      </w:pPr>
+      <w:r>
+        <w:rPr>
+          <w:b/>
+        </w:rPr>
+        <w:t xml:space="preserve">The 09-23 queue is superseded.</w:t>
+      </w:r>
+      <w:r>
+        <w:t xml:space="preserve"> </w:t>
+      </w:r>
+      <w:r>
+        <w:t xml:space="preserve">§3.1 (neutral pile) and §3.3 (severity)</w:t>
+      </w:r>
+      <w:r>
+        <w:t xml:space="preserve"> </w:t>
+      </w:r>
+      <w:r>
+        <w:t xml:space="preserve">there are answered by this round: the neutral pile held signal and the</w:t>
+      </w:r>
+      <w:r>
+        <w:t xml:space="preserve"> </w:t>
+      </w:r>
+      <w:r>
+        <w:t xml:space="preserve">format released it; severity grading is still absent and is now a</w:t>
+      </w:r>
+      <w:r>
+        <w:t xml:space="preserve"> </w:t>
+      </w:r>
+      <w:r>
+        <w:t xml:space="preserve">measured gap rather than a hypothesis.</w:t>
+      </w:r>
+    </w:p>
+    <w:p>
+      <w:pPr>
+        <w:pStyle w:val="Heading2"/>
+      </w:pPr>
+      <w:bookmarkStart w:id="30" w:name="X337b60c4e6c0ab6536d7a503ba7fd2f31e6d935"/>
+      <w:r>
+        <w:t xml:space="preserve">§4 The instrument — carried, with three additions</w:t>
+      </w:r>
+      <w:bookmarkEnd w:id="30"/>
+    </w:p>
+    <w:p>
+      <w:pPr>
+        <w:numPr>
+          <w:ilvl w:val="0"/>
+          <w:numId w:val="1006"/>
+        </w:numPr>
+        <w:pStyle w:val="Compact"/>
+      </w:pPr>
+      <w:r>
+        <w:rPr>
+          <w:b/>
+        </w:rPr>
+        <w:t xml:space="preserve">Noise floor is ~17%, not 12.8%.</w:t>
+      </w:r>
+      <w:r>
+        <w:t xml:space="preserve"> </w:t>
+      </w:r>
+      <w:r>
+        <w:t xml:space="preserve">Tune 17.7% (13.5–23.0), train 16.7%,</w:t>
+      </w:r>
+      <w:r>
+        <w:t xml:space="preserve"> </w:t>
+      </w:r>
+      <w:r>
+        <w:t xml:space="preserve">Test 4's 12.8% inside both ranges. v6 disagrees with itself on one call in</w:t>
+      </w:r>
+      <w:r>
+        <w:t xml:space="preserve"> </w:t>
+      </w:r>
+      <w:r>
+        <w:t xml:space="preserve">six.</w:t>
+      </w:r>
+    </w:p>
+    <w:p>
+      <w:pPr>
+        <w:numPr>
+          <w:ilvl w:val="0"/>
+          <w:numId w:val="1006"/>
+        </w:numPr>
+        <w:pStyle w:val="Compact"/>
+      </w:pPr>
+      <w:r>
+        <w:rPr>
+          <w:b/>
+        </w:rPr>
+        <w:t xml:space="preserve">v6's cached baseline leans lucky.</w:t>
+      </w:r>
+      <w:r>
+        <w:t xml:space="preserve"> </w:t>
+      </w:r>
+      <w:r>
+        <w:t xml:space="preserve">Among noise flips where exactly one</w:t>
+      </w:r>
+      <w:r>
+        <w:t xml:space="preserve"> </w:t>
+      </w:r>
+      <w:r>
+        <w:t xml:space="preserve">answer was right, the cached call won 23 times and the fresh call 12</w:t>
+      </w:r>
+      <w:r>
+        <w:t xml:space="preserve"> </w:t>
+      </w:r>
+      <w:r>
+        <w:t xml:space="preserve">(p=0.09, 35 decisive flips). Not settled. If real, every prior comparison</w:t>
+      </w:r>
+      <w:r>
+        <w:t xml:space="preserve"> </w:t>
+      </w:r>
+      <w:r>
+        <w:t xml:space="preserve">flattered v6 slightly and B's result is conservative.</w:t>
+      </w:r>
+      <w:r>
+        <w:t xml:space="preserve"> </w:t>
+      </w:r>
+      <w:r>
+        <w:rPr>
+          <w:b/>
+        </w:rPr>
+        <w:t xml:space="preserve">Nothing in §2.2</w:t>
+      </w:r>
+      <w:r>
+        <w:rPr>
+          <w:b/>
+        </w:rPr>
+        <w:t xml:space="preserve"> </w:t>
+      </w:r>
+      <w:r>
+        <w:rPr>
+          <w:b/>
+        </w:rPr>
+        <w:t xml:space="preserve">depends on it</w:t>
+      </w:r>
+      <w:r>
+        <w:t xml:space="preserve"> </w:t>
+      </w:r>
+      <w:r>
+        <w:t xml:space="preserve">— conditions 1–3 do not use v6's accuracy.</w:t>
+      </w:r>
+    </w:p>
+    <w:p>
+      <w:pPr>
+        <w:numPr>
+          <w:ilvl w:val="0"/>
+          <w:numId w:val="1006"/>
+        </w:numPr>
+        <w:pStyle w:val="Compact"/>
+      </w:pPr>
+      <w:r>
+        <w:rPr>
+          <w:b/>
+        </w:rPr>
+        <w:t xml:space="preserve">Flip-count rules in</w:t>
+      </w:r>
+      <w:r>
+        <w:rPr>
+          <w:b/>
+        </w:rPr>
+        <w:t xml:space="preserve"> </w:t>
+      </w:r>
+      <w:r>
+        <w:rPr>
+          <w:rStyle w:val="VerbatimChar"/>
+          <w:b/>
+        </w:rPr>
+        <w:t xml:space="preserve">PROMPT_ARCHITECTURE.md</w:t>
+      </w:r>
+      <w:r>
+        <w:rPr>
+          <w:b/>
+        </w:rPr>
+        <w:t xml:space="preserve"> </w:t>
+      </w:r>
+      <w:r>
+        <w:rPr>
+          <w:b/>
+        </w:rPr>
+        <w:t xml:space="preserve">§2.4/§2.5 are still</w:t>
+      </w:r>
+      <w:r>
+        <w:rPr>
+          <w:b/>
+        </w:rPr>
+        <w:t xml:space="preserve"> </w:t>
+      </w:r>
+      <w:r>
+        <w:rPr>
+          <w:b/>
+        </w:rPr>
+        <w:t xml:space="preserve">computed on raw flips</w:t>
+      </w:r>
+      <w:r>
+        <w:t xml:space="preserve"> </w:t>
+      </w:r>
+      <w:r>
+        <w:t xml:space="preserve">and still uncorrected. Every flip figure this week</w:t>
+      </w:r>
+      <w:r>
+        <w:t xml:space="preserve"> </w:t>
+      </w:r>
+      <w:r>
+        <w:t xml:space="preserve">was reported raw and net; the file was not edited.</w:t>
+      </w:r>
+    </w:p>
+    <w:p>
+      <w:pPr>
+        <w:numPr>
+          <w:ilvl w:val="0"/>
+          <w:numId w:val="1006"/>
+        </w:numPr>
+        <w:pStyle w:val="Compact"/>
+      </w:pPr>
+      <w:r>
+        <w:rPr>
+          <w:b/>
+        </w:rPr>
+        <w:t xml:space="preserve">A 1.0-point discrepancy</w:t>
+      </w:r>
+      <w:r>
+        <w:t xml:space="preserve"> </w:t>
+      </w:r>
+      <w:r>
+        <w:t xml:space="preserve">in the pooled v6 swap median (7.70 here vs 8.7</w:t>
+      </w:r>
+      <w:r>
+        <w:t xml:space="preserve"> </w:t>
+      </w:r>
+      <w:r>
+        <w:t xml:space="preserve">in the 09-23 document) is unreconciled. The mean reproduces.</w:t>
+      </w:r>
+    </w:p>
+    <w:p>
+      <w:pPr>
+        <w:numPr>
+          <w:ilvl w:val="0"/>
+          <w:numId w:val="1006"/>
+        </w:numPr>
+        <w:pStyle w:val="Compact"/>
+      </w:pPr>
+      <w:r>
+        <w:t xml:space="preserve">The 177-bearish-call resolution limit for subset questions stands; the</w:t>
+      </w:r>
+      <w:r>
+        <w:t xml:space="preserve"> </w:t>
+      </w:r>
+      <w:r>
+        <w:t xml:space="preserve">rank test on all calls is how this round got around it.</w:t>
+      </w:r>
+    </w:p>
+    <w:p>
+      <w:pPr>
+        <w:numPr>
+          <w:ilvl w:val="0"/>
+          <w:numId w:val="1006"/>
+        </w:numPr>
+        <w:pStyle w:val="Compact"/>
+      </w:pPr>
+      <w:r>
+        <w:t xml:space="preserve">Paramount excluded on train (corrupt prices); WOLF, SPWR, BNY (no</w:t>
+      </w:r>
+      <w:r>
+        <w:t xml:space="preserve"> </w:t>
+      </w:r>
+      <w:r>
+        <w:t xml:space="preserve">transcripts) excluded on tune. Dividends ignored. Sector-relative grading</w:t>
+      </w:r>
+      <w:r>
+        <w:t xml:space="preserve"> </w:t>
+      </w:r>
+      <w:r>
+        <w:t xml:space="preserve">unresolved.</w:t>
+      </w:r>
+    </w:p>
+    <w:p>
+      <w:pPr>
+        <w:pStyle w:val="Heading2"/>
+      </w:pPr>
+      <w:bookmarkStart w:id="31" w:name="X2da428b132a111903d571f926b050d1094b6d91"/>
+      <w:r>
+        <w:t xml:space="preserve">§5 Decided 2026-09-25 — improve the analyst on its own; rebuild the allocator after</w:t>
+      </w:r>
+      <w:bookmarkEnd w:id="31"/>
+    </w:p>
+    <w:p>
+      <w:pPr>
+        <w:pStyle w:val="FirstParagraph"/>
+      </w:pPr>
+      <w:r>
+        <w:rPr>
+          <w:b/>
+        </w:rPr>
+        <w:t xml:space="preserve">The reasoning, in Luis's words.</w:t>
+      </w:r>
+      <w:r>
+        <w:t xml:space="preserve"> </w:t>
+      </w:r>
+      <w:r>
+        <w:t xml:space="preserve">The benchmark-beating result was mostly</w:t>
+      </w:r>
+      <w:r>
+        <w:t xml:space="preserve"> </w:t>
+      </w:r>
+      <w:r>
+        <w:t xml:space="preserve">the allocator's; v6 is barely better than luck overall, with one real skill</w:t>
+      </w:r>
+      <w:r>
+        <w:t xml:space="preserve"> </w:t>
+      </w:r>
+      <w:r>
+        <w:t xml:space="preserve">(bearish calls); the minimal prompt and the newer model have now shown the</w:t>
+      </w:r>
+      <w:r>
+        <w:t xml:space="preserve"> </w:t>
+      </w:r>
+      <w:r>
+        <w:t xml:space="preserve">analyst</w:t>
+      </w:r>
+      <w:r>
+        <w:t xml:space="preserve"> </w:t>
+      </w:r>
+      <w:r>
+        <w:rPr>
+          <w:i/>
+        </w:rPr>
+        <w:t xml:space="preserve">can</w:t>
+      </w:r>
+      <w:r>
+        <w:t xml:space="preserve"> </w:t>
+      </w:r>
+      <w:r>
+        <w:t xml:space="preserve">be improved, and by how much is unknown. Developing both</w:t>
+      </w:r>
+      <w:r>
+        <w:t xml:space="preserve"> </w:t>
+      </w:r>
+      <w:r>
+        <w:t xml:space="preserve">layers at once for five months hid which one was adding value. So: improve</w:t>
+      </w:r>
+      <w:r>
+        <w:t xml:space="preserve"> </w:t>
+      </w:r>
+      <w:r>
+        <w:t xml:space="preserve">the analyst alone, on its own ruler, and build the allocator around whatever</w:t>
+      </w:r>
+      <w:r>
+        <w:t xml:space="preserve"> </w:t>
+      </w:r>
+      <w:r>
+        <w:t xml:space="preserve">it turns out to be good at.</w:t>
+      </w:r>
+    </w:p>
+    <w:p>
+      <w:pPr>
+        <w:pStyle w:val="BodyText"/>
+      </w:pPr>
+      <w:r>
+        <w:rPr>
+          <w:b/>
+        </w:rPr>
+        <w:t xml:space="preserve">5.1 Bookkeeping, $0, first.</w:t>
+      </w:r>
+      <w:r>
+        <w:t xml:space="preserve"> </w:t>
+      </w:r>
+      <w:r>
+        <w:t xml:space="preserve">Record the</w:t>
+      </w:r>
+      <w:r>
+        <w:t xml:space="preserve"> </w:t>
+      </w:r>
+      <w:r>
+        <w:rPr>
+          <w:rStyle w:val="VerbatimChar"/>
+        </w:rPr>
+        <w:t xml:space="preserve">data/gate_ledger.json</w:t>
+      </w:r>
+      <w:r>
+        <w:t xml:space="preserve"> </w:t>
+      </w:r>
+      <w:r>
+        <w:t xml:space="preserve">entry for</w:t>
+      </w:r>
+      <w:r>
+        <w:t xml:space="preserve"> </w:t>
+      </w:r>
+      <w:r>
+        <w:rPr>
+          <w:rStyle w:val="VerbatimChar"/>
+        </w:rPr>
+        <w:t xml:space="preserve">P6B-minimal</w:t>
+      </w:r>
+      <w:r>
+        <w:t xml:space="preserve"> </w:t>
+      </w:r>
+      <w:r>
+        <w:t xml:space="preserve">vs</w:t>
+      </w:r>
+      <w:r>
+        <w:t xml:space="preserve"> </w:t>
+      </w:r>
+      <w:r>
+        <w:rPr>
+          <w:rStyle w:val="VerbatimChar"/>
+        </w:rPr>
+        <w:t xml:space="preserve">v6</w:t>
+      </w:r>
+      <w:r>
+        <w:t xml:space="preserve"> </w:t>
+      </w:r>
+      <w:r>
+        <w:t xml:space="preserve">(§2.2a prompt change: analyst-direct PROMOTE on two</w:t>
+      </w:r>
+      <w:r>
+        <w:t xml:space="preserve"> </w:t>
+      </w:r>
+      <w:r>
+        <w:t xml:space="preserve">splits; end-to-end no regression against A0′ in sixteen cuts, +30% on gain</w:t>
+      </w:r>
+      <w:r>
+        <w:t xml:space="preserve"> </w:t>
+      </w:r>
+      <w:r>
+        <w:t xml:space="preserve">per point of drawdown).</w:t>
+      </w:r>
+      <w:r>
+        <w:t xml:space="preserve"> </w:t>
+      </w:r>
+      <w:r>
+        <w:rPr>
+          <w:b/>
+        </w:rPr>
+        <w:t xml:space="preserve">Make B the research champion</w:t>
+      </w:r>
+      <w:r>
+        <w:t xml:space="preserve"> </w:t>
+      </w:r>
+      <w:r>
+        <w:t xml:space="preserve">— the incumbent</w:t>
+      </w:r>
+      <w:r>
+        <w:t xml:space="preserve"> </w:t>
+      </w:r>
+      <w:r>
+        <w:t xml:space="preserve">every future candidate is compared against — in the registry.</w:t>
+      </w:r>
+      <w:r>
+        <w:t xml:space="preserve"> </w:t>
+      </w:r>
+      <w:r>
+        <w:rPr>
+          <w:b/>
+        </w:rPr>
+        <w:t xml:space="preserve">Production</w:t>
+      </w:r>
+      <w:r>
+        <w:rPr>
+          <w:b/>
+        </w:rPr>
+        <w:t xml:space="preserve"> </w:t>
+      </w:r>
+      <w:r>
+        <w:rPr>
+          <w:b/>
+        </w:rPr>
+        <w:t xml:space="preserve">stays on v6</w:t>
+      </w:r>
+      <w:r>
+        <w:t xml:space="preserve">; cut-over is a separate, later decision and is not on this</w:t>
+      </w:r>
+      <w:r>
+        <w:t xml:space="preserve"> </w:t>
+      </w:r>
+      <w:r>
+        <w:t xml:space="preserve">list. Correct the flip-count rules (</w:t>
+      </w:r>
+      <w:r>
+        <w:rPr>
+          <w:rStyle w:val="VerbatimChar"/>
+        </w:rPr>
+        <w:t xml:space="preserve">PROMPT_ARCHITECTURE.md</w:t>
+      </w:r>
+      <w:r>
+        <w:t xml:space="preserve"> </w:t>
+      </w:r>
+      <w:r>
+        <w:t xml:space="preserve">§2.4/§2.5).</w:t>
+      </w:r>
+      <w:r>
+        <w:t xml:space="preserve"> </w:t>
+      </w:r>
+      <w:r>
+        <w:t xml:space="preserve">Record that the portfolio-side comparator is A0′ from here on.</w:t>
+      </w:r>
+    </w:p>
+    <w:p>
+      <w:pPr>
+        <w:pStyle w:val="BodyText"/>
+      </w:pPr>
+      <w:r>
+        <w:rPr>
+          <w:b/>
+        </w:rPr>
+        <w:t xml:space="preserve">5.2 B's noise floor, ~$15, before any B-derived candidate.</w:t>
+      </w:r>
+      <w:r>
+        <w:t xml:space="preserve"> </w:t>
+      </w:r>
+      <w:r>
+        <w:t xml:space="preserve">v6 disagrees</w:t>
+      </w:r>
+      <w:r>
+        <w:t xml:space="preserve"> </w:t>
+      </w:r>
+      <w:r>
+        <w:t xml:space="preserve">with itself on one call in six. B's run-to-run consistency has never been</w:t>
+      </w:r>
+      <w:r>
+        <w:t xml:space="preserve"> </w:t>
+      </w:r>
+      <w:r>
+        <w:t xml:space="preserve">measured. A paired re-score of B on train, per stratum, is the floor every</w:t>
+      </w:r>
+      <w:r>
+        <w:t xml:space="preserve"> </w:t>
+      </w:r>
+      <w:r>
+        <w:t xml:space="preserve">P7/P8 flip count is netted against. Without it the first candidate result is</w:t>
+      </w:r>
+      <w:r>
+        <w:t xml:space="preserve"> </w:t>
+      </w:r>
+      <w:r>
+        <w:t xml:space="preserve">unreadable.</w:t>
+      </w:r>
+    </w:p>
+    <w:p>
+      <w:pPr>
+        <w:pStyle w:val="BodyText"/>
+      </w:pPr>
+      <w:r>
+        <w:rPr>
+          <w:b/>
+        </w:rPr>
+        <w:t xml:space="preserve">5.3 The campaign — three open questions, one candidate each, in this</w:t>
+      </w:r>
+      <w:r>
+        <w:rPr>
+          <w:b/>
+        </w:rPr>
+        <w:t xml:space="preserve"> </w:t>
+      </w:r>
+      <w:r>
+        <w:rPr>
+          <w:b/>
+        </w:rPr>
+        <w:t xml:space="preserve">order.</w:t>
+      </w:r>
+      <w:r>
+        <w:t xml:space="preserve"> </w:t>
+      </w:r>
+      <w:r>
+        <w:t xml:space="preserve">Each runs train → tune on B's ruler (rank correlation across all</w:t>
+      </w:r>
+      <w:r>
+        <w:t xml:space="preserve"> </w:t>
+      </w:r>
+      <w:r>
+        <w:t xml:space="preserve">calls; money; bearish and bullish precision against base rates), against B</w:t>
+      </w:r>
+      <w:r>
+        <w:t xml:space="preserve"> </w:t>
+      </w:r>
+      <w:r>
+        <w:t xml:space="preserve">as incumbent, pre-registered in</w:t>
+      </w:r>
+      <w:r>
+        <w:t xml:space="preserve"> </w:t>
+      </w:r>
+      <w:r>
+        <w:rPr>
+          <w:rStyle w:val="VerbatimChar"/>
+        </w:rPr>
+        <w:t xml:space="preserve">PROMPT_ARCHITECTURE.md</w:t>
+      </w:r>
+      <w:r>
+        <w:t xml:space="preserve"> </w:t>
+      </w:r>
+      <w:r>
+        <w:t xml:space="preserve">§2.2 before it</w:t>
+      </w:r>
+      <w:r>
+        <w:t xml:space="preserve"> </w:t>
+      </w:r>
+      <w:r>
+        <w:t xml:space="preserve">runs.</w:t>
+      </w:r>
+    </w:p>
+    <w:tbl>
+      <w:tblPr>
+        <w:tblStyle w:val="Table"/>
+        <w:tblW w:type="pct" w:w="0.0"/>
+        <w:tblLook w:firstRow="1"/>
+      </w:tblPr>
+      <w:tblGrid/>
+      <w:tr>
+        <w:trPr>
+          <w:cnfStyle w:firstRow="1"/>
+        </w:trPr>
+        <w:tc>
+          <w:tcPr>
+            <w:tcBorders>
+              <w:bottom w:val="single"/>
+            </w:tcBorders>
+            <w:vAlign w:val="bottom"/>
+          </w:tcPr>
+          <w:p>
+            <w:pPr>
+              <w:pStyle w:val="Compact"/>
+              <w:jc w:val="left"/>
+            </w:pPr>
+            <w:r>
+              <w:t xml:space="preserve">question</w:t>
+            </w:r>
+          </w:p>
+        </w:tc>
+        <w:tc>
+          <w:tcPr>
+            <w:tcBorders>
+              <w:bottom w:val="single"/>
+            </w:tcBorders>
+            <w:vAlign w:val="bottom"/>
+          </w:tcPr>
+          <w:p>
+            <w:pPr>
+              <w:pStyle w:val="Compact"/>
+              <w:jc w:val="left"/>
+            </w:pPr>
+            <w:r>
+              <w:t xml:space="preserve">candidate</w:t>
+            </w:r>
+          </w:p>
+        </w:tc>
+        <w:tc>
+          <w:tcPr>
+            <w:tcBorders>
+              <w:bottom w:val="single"/>
+            </w:tcBorders>
+            <w:vAlign w:val="bottom"/>
+          </w:tcPr>
+          <w:p>
+            <w:pPr>
+              <w:pStyle w:val="Compact"/>
+              <w:jc w:val="left"/>
+            </w:pPr>
+            <w:r>
+              <w:t xml:space="preserve">what it changes</w:t>
             </w:r>
           </w:p>
         </w:tc>
@@ -3247,29 +4265,44 @@
               <w:jc w:val="left"/>
             </w:pPr>
             <w:r>
-              <w:t xml:space="preserve">P8</w:t>
-            </w:r>
-          </w:p>
-        </w:tc>
-        <w:tc>
-          <w:p>
-            <w:pPr>
-              <w:pStyle w:val="Compact"/>
-              <w:jc w:val="left"/>
-            </w:pPr>
-            <w:r>
-              <w:t xml:space="preserve">auto-iterate as generator, from B, with the 2026-09-24 constraints</w:t>
-            </w:r>
-          </w:p>
-        </w:tc>
-        <w:tc>
-          <w:p>
-            <w:pPr>
-              <w:pStyle w:val="Compact"/>
-              <w:jc w:val="left"/>
-            </w:pPr>
-            <w:r>
-              <w:t xml:space="preserve">named, not built</w:t>
+              <w:rPr>
+                <w:b/>
+              </w:rPr>
+              <w:t xml:space="preserve">Bullish discrimination</w:t>
+            </w:r>
+            <w:r>
+              <w:t xml:space="preserve"> </w:t>
+            </w:r>
+            <w:r>
+              <w:t xml:space="preserve">— no prompt has any</w:t>
+            </w:r>
+          </w:p>
+        </w:tc>
+        <w:tc>
+          <w:p>
+            <w:pPr>
+              <w:pStyle w:val="Compact"/>
+              <w:jc w:val="left"/>
+            </w:pPr>
+            <w:r>
+              <w:rPr>
+                <w:b/>
+              </w:rPr>
+              <w:t xml:space="preserve">P7, three voices, from B</w:t>
+            </w:r>
+            <w:r>
+              <w:t xml:space="preserve">: what the CFO's numbers say, what the CEO claims beyond them, what the analysts actually pressed on; score the gap</w:t>
+            </w:r>
+          </w:p>
+        </w:tc>
+        <w:tc>
+          <w:p>
+            <w:pPr>
+              <w:pStyle w:val="Compact"/>
+              <w:jc w:val="left"/>
+            </w:pPr>
+            <w:r>
+              <w:t xml:space="preserve">the expectations-gap question asked of the transcript alone</w:t>
             </w:r>
           </w:p>
         </w:tc>
@@ -3282,6 +4315,608 @@
               <w:jc w:val="left"/>
             </w:pPr>
             <w:r>
+              <w:rPr>
+                <w:b/>
+              </w:rPr>
+              <w:t xml:space="preserve">Magnitude below +1</w:t>
+            </w:r>
+            <w:r>
+              <w:t xml:space="preserve"> </w:t>
+            </w:r>
+            <w:r>
+              <w:t xml:space="preserve">— B's score is flat from −4 to +1</w:t>
+            </w:r>
+          </w:p>
+        </w:tc>
+        <w:tc>
+          <w:p>
+            <w:pPr>
+              <w:pStyle w:val="Compact"/>
+              <w:jc w:val="left"/>
+            </w:pPr>
+            <w:r>
+              <w:rPr>
+                <w:b/>
+              </w:rPr>
+              <w:t xml:space="preserve">P9, expected return</w:t>
+            </w:r>
+            <w:r>
+              <w:t xml:space="preserve">: ask for an expected six-month return vs the S&amp;P in percent, with a range, instead of a −5..+5 label</w:t>
+            </w:r>
+          </w:p>
+        </w:tc>
+        <w:tc>
+          <w:p>
+            <w:pPr>
+              <w:pStyle w:val="Compact"/>
+              <w:jc w:val="left"/>
+            </w:pPr>
+            <w:r>
+              <w:t xml:space="preserve">severity becomes a number; tested on rank correlation</w:t>
+            </w:r>
+            <w:r>
+              <w:t xml:space="preserve"> </w:t>
+            </w:r>
+            <w:r>
+              <w:rPr>
+                <w:i/>
+              </w:rPr>
+              <w:t xml:space="preserve">and</w:t>
+            </w:r>
+            <w:r>
+              <w:t xml:space="preserve"> </w:t>
+            </w:r>
+            <w:r>
+              <w:t xml:space="preserve">calibration (do the −20% calls fall ~20%?)</w:t>
+            </w:r>
+          </w:p>
+        </w:tc>
+      </w:tr>
+      <w:tr>
+        <w:tc>
+          <w:p>
+            <w:pPr>
+              <w:pStyle w:val="Compact"/>
+              <w:jc w:val="left"/>
+            </w:pPr>
+            <w:r>
+              <w:rPr>
+                <w:b/>
+              </w:rPr>
+              <w:t xml:space="preserve">The reader</w:t>
+            </w:r>
+            <w:r>
+              <w:t xml:space="preserve"> </w:t>
+            </w:r>
+            <w:r>
+              <w:t xml:space="preserve">— the model moved v6 by $16k, the prompt by $10k</w:t>
+            </w:r>
+          </w:p>
+        </w:tc>
+        <w:tc>
+          <w:p>
+            <w:pPr>
+              <w:pStyle w:val="Compact"/>
+              <w:jc w:val="left"/>
+            </w:pPr>
+            <w:r>
+              <w:rPr>
+                <w:b/>
+              </w:rPr>
+              <w:t xml:space="preserve">model gate on B</w:t>
+            </w:r>
+            <w:r>
+              <w:t xml:space="preserve"> </w:t>
+            </w:r>
+            <w:r>
+              <w:t xml:space="preserve">(§2.2b, equivalence hurdle): a newer or larger model on the unchanged minimal prompt</w:t>
+            </w:r>
+          </w:p>
+        </w:tc>
+        <w:tc>
+          <w:p>
+            <w:pPr>
+              <w:pStyle w:val="Compact"/>
+              <w:jc w:val="left"/>
+            </w:pPr>
+            <w:r>
+              <w:t xml:space="preserve">the second lever; recall exposure rises with newer models, so tune/holdout discipline matters more, not less</w:t>
+            </w:r>
+          </w:p>
+        </w:tc>
+      </w:tr>
+    </w:tbl>
+    <w:p>
+      <w:pPr>
+        <w:pStyle w:val="BodyText"/>
+      </w:pPr>
+      <w:r>
+        <w:t xml:space="preserve">Then</w:t>
+      </w:r>
+      <w:r>
+        <w:t xml:space="preserve"> </w:t>
+      </w:r>
+      <w:r>
+        <w:rPr>
+          <w:b/>
+        </w:rPr>
+        <w:t xml:space="preserve">P8</w:t>
+      </w:r>
+      <w:r>
+        <w:t xml:space="preserve"> </w:t>
+      </w:r>
+      <w:r>
+        <w:t xml:space="preserve">(auto-iterate from B, generator never judge, the 2026-09-24</w:t>
+      </w:r>
+      <w:r>
+        <w:t xml:space="preserve"> </w:t>
+      </w:r>
+      <w:r>
+        <w:t xml:space="preserve">constraints) as the hypothesis source, and</w:t>
+      </w:r>
+      <w:r>
+        <w:t xml:space="preserve"> </w:t>
+      </w:r>
+      <w:r>
+        <w:rPr>
+          <w:b/>
+        </w:rPr>
+        <w:t xml:space="preserve">P4</w:t>
+      </w:r>
+      <w:r>
+        <w:t xml:space="preserve"> </w:t>
+      </w:r>
+      <w:r>
+        <w:t xml:space="preserve">(XBRL facts) last, once</w:t>
+      </w:r>
+      <w:r>
+        <w:t xml:space="preserve"> </w:t>
+      </w:r>
+      <w:r>
+        <w:t xml:space="preserve">the prompt's shape has settled.</w:t>
+      </w:r>
+    </w:p>
+    <w:p>
+      <w:pPr>
+        <w:pStyle w:val="BodyText"/>
+      </w:pPr>
+      <w:r>
+        <w:rPr>
+          <w:b/>
+        </w:rPr>
+        <w:t xml:space="preserve">5.4 One tether to the allocator, ~$8 per promoted candidate.</w:t>
+      </w:r>
+      <w:r>
+        <w:t xml:space="preserve"> </w:t>
+      </w:r>
+      <w:r>
+        <w:t xml:space="preserve">Not</w:t>
+      </w:r>
+      <w:r>
+        <w:t xml:space="preserve"> </w:t>
+      </w:r>
+      <w:r>
+        <w:t xml:space="preserve">co-development: the end-to-end check run once per research promotion,</w:t>
+      </w:r>
+      <w:r>
+        <w:t xml:space="preserve"> </w:t>
+      </w:r>
+      <w:r>
+        <w:t xml:space="preserve">against A0′, as a smoke test that the signal is still convertible to</w:t>
+      </w:r>
+      <w:r>
+        <w:t xml:space="preserve"> </w:t>
+      </w:r>
+      <w:r>
+        <w:t xml:space="preserve">dollars by</w:t>
+      </w:r>
+      <w:r>
+        <w:t xml:space="preserve"> </w:t>
+      </w:r>
+      <w:r>
+        <w:rPr>
+          <w:i/>
+        </w:rPr>
+        <w:t xml:space="preserve">some</w:t>
+      </w:r>
+      <w:r>
+        <w:t xml:space="preserve"> </w:t>
+      </w:r>
+      <w:r>
+        <w:t xml:space="preserve">allocator. The current allocator's preferences (it pays</w:t>
+      </w:r>
+      <w:r>
+        <w:t xml:space="preserve"> </w:t>
+      </w:r>
+      <w:r>
+        <w:t xml:space="preserve">for bearish precision and slow deployment, ignores bullish ranking beyond</w:t>
+      </w:r>
+      <w:r>
+        <w:t xml:space="preserve"> </w:t>
+      </w:r>
+      <w:r>
+        <w:t xml:space="preserve">the starter) are facts about the old allocator and are not design targets.</w:t>
+      </w:r>
+    </w:p>
+    <w:p>
+      <w:pPr>
+        <w:pStyle w:val="BodyText"/>
+      </w:pPr>
+      <w:r>
+        <w:rPr>
+          <w:b/>
+        </w:rPr>
+        <w:t xml:space="preserve">5.5 Holdout discipline.</w:t>
+      </w:r>
+      <w:r>
+        <w:t xml:space="preserve"> </w:t>
+      </w:r>
+      <w:r>
+        <w:t xml:space="preserve">B has had its one look at tune. Every</w:t>
+      </w:r>
+      <w:r>
+        <w:t xml:space="preserve"> </w:t>
+      </w:r>
+      <w:r>
+        <w:t xml:space="preserve">B-derived candidate runs train → tune.</w:t>
+      </w:r>
+      <w:r>
+        <w:t xml:space="preserve"> </w:t>
+      </w:r>
+      <w:r>
+        <w:rPr>
+          <w:b/>
+        </w:rPr>
+        <w:t xml:space="preserve">Holdout stays locked until the</w:t>
+      </w:r>
+      <w:r>
+        <w:rPr>
+          <w:b/>
+        </w:rPr>
+        <w:t xml:space="preserve"> </w:t>
+      </w:r>
+      <w:r>
+        <w:rPr>
+          <w:b/>
+        </w:rPr>
+        <w:t xml:space="preserve">campaign produces a final candidate, and gets one look.</w:t>
+      </w:r>
+    </w:p>
+    <w:p>
+      <w:pPr>
+        <w:pStyle w:val="BodyText"/>
+      </w:pPr>
+      <w:r>
+        <w:rPr>
+          <w:b/>
+        </w:rPr>
+        <w:t xml:space="preserve">P6D (the allocator fields) is deferred</w:t>
+      </w:r>
+      <w:r>
+        <w:t xml:space="preserve">, not dropped: it is the first</w:t>
+      </w:r>
+      <w:r>
+        <w:t xml:space="preserve"> </w:t>
+      </w:r>
+      <w:r>
+        <w:t xml:space="preserve">task of the allocator rebuild, and the rebuild consumes a continuous score</w:t>
+      </w:r>
+      <w:r>
+        <w:t xml:space="preserve"> </w:t>
+      </w:r>
+      <w:r>
+        <w:t xml:space="preserve">with thresholds on the allocator side.</w:t>
+      </w:r>
+    </w:p>
+    <w:p>
+      <w:pPr>
+        <w:pStyle w:val="Heading2"/>
+      </w:pPr>
+      <w:bookmarkStart w:id="32" w:name="X8eda71b708772f9f73472dd19a370e05b806e5e"/>
+      <w:r>
+        <w:t xml:space="preserve">§6 Queue, after 2026-09-25</w:t>
+      </w:r>
+      <w:bookmarkEnd w:id="32"/>
+    </w:p>
+    <w:tbl>
+      <w:tblPr>
+        <w:tblStyle w:val="Table"/>
+        <w:tblW w:type="pct" w:w="0.0"/>
+        <w:tblLook w:firstRow="1"/>
+      </w:tblPr>
+      <w:tblGrid/>
+      <w:tr>
+        <w:trPr>
+          <w:cnfStyle w:firstRow="1"/>
+        </w:trPr>
+        <w:tc>
+          <w:tcPr>
+            <w:tcBorders>
+              <w:bottom w:val="single"/>
+            </w:tcBorders>
+            <w:vAlign w:val="bottom"/>
+          </w:tcPr>
+          <w:p>
+            <w:pPr>
+              <w:pStyle w:val="Compact"/>
+              <w:jc w:val="left"/>
+            </w:pPr>
+            <w:r>
+              <w:t xml:space="preserve">#</w:t>
+            </w:r>
+          </w:p>
+        </w:tc>
+        <w:tc>
+          <w:tcPr>
+            <w:tcBorders>
+              <w:bottom w:val="single"/>
+            </w:tcBorders>
+            <w:vAlign w:val="bottom"/>
+          </w:tcPr>
+          <w:p>
+            <w:pPr>
+              <w:pStyle w:val="Compact"/>
+              <w:jc w:val="left"/>
+            </w:pPr>
+            <w:r>
+              <w:t xml:space="preserve">candidate</w:t>
+            </w:r>
+          </w:p>
+        </w:tc>
+        <w:tc>
+          <w:tcPr>
+            <w:tcBorders>
+              <w:bottom w:val="single"/>
+            </w:tcBorders>
+            <w:vAlign w:val="bottom"/>
+          </w:tcPr>
+          <w:p>
+            <w:pPr>
+              <w:pStyle w:val="Compact"/>
+              <w:jc w:val="left"/>
+            </w:pPr>
+            <w:r>
+              <w:t xml:space="preserve">status</w:t>
+            </w:r>
+          </w:p>
+        </w:tc>
+      </w:tr>
+      <w:tr>
+        <w:tc>
+          <w:p>
+            <w:pPr>
+              <w:pStyle w:val="Compact"/>
+              <w:jc w:val="left"/>
+            </w:pPr>
+            <w:r>
+              <w:t xml:space="preserve">—</w:t>
+            </w:r>
+          </w:p>
+        </w:tc>
+        <w:tc>
+          <w:p>
+            <w:pPr>
+              <w:pStyle w:val="Compact"/>
+              <w:jc w:val="left"/>
+            </w:pPr>
+            <w:r>
+              <w:t xml:space="preserve">ledger entry; B = research champion; flip-count rules; A0′ as comparator</w:t>
+            </w:r>
+          </w:p>
+        </w:tc>
+        <w:tc>
+          <w:p>
+            <w:pPr>
+              <w:pStyle w:val="Compact"/>
+              <w:jc w:val="left"/>
+            </w:pPr>
+            <w:r>
+              <w:rPr>
+                <w:b/>
+              </w:rPr>
+              <w:t xml:space="preserve">next, $0</w:t>
+            </w:r>
+            <w:r>
+              <w:t xml:space="preserve"> </w:t>
+            </w:r>
+            <w:r>
+              <w:t xml:space="preserve">(§5.1)</w:t>
+            </w:r>
+          </w:p>
+        </w:tc>
+      </w:tr>
+      <w:tr>
+        <w:tc>
+          <w:p>
+            <w:pPr>
+              <w:pStyle w:val="Compact"/>
+              <w:jc w:val="left"/>
+            </w:pPr>
+            <w:r>
+              <w:t xml:space="preserve">—</w:t>
+            </w:r>
+          </w:p>
+        </w:tc>
+        <w:tc>
+          <w:p>
+            <w:pPr>
+              <w:pStyle w:val="Compact"/>
+              <w:jc w:val="left"/>
+            </w:pPr>
+            <w:r>
+              <w:t xml:space="preserve">B's noise floor (paired re-score, train, per stratum)</w:t>
+            </w:r>
+          </w:p>
+        </w:tc>
+        <w:tc>
+          <w:p>
+            <w:pPr>
+              <w:pStyle w:val="Compact"/>
+              <w:jc w:val="left"/>
+            </w:pPr>
+            <w:r>
+              <w:rPr>
+                <w:b/>
+              </w:rPr>
+              <w:t xml:space="preserve">next, ~$15</w:t>
+            </w:r>
+            <w:r>
+              <w:t xml:space="preserve"> </w:t>
+            </w:r>
+            <w:r>
+              <w:t xml:space="preserve">(§5.2)</w:t>
+            </w:r>
+          </w:p>
+        </w:tc>
+      </w:tr>
+      <w:tr>
+        <w:tc>
+          <w:p>
+            <w:pPr>
+              <w:pStyle w:val="Compact"/>
+              <w:jc w:val="left"/>
+            </w:pPr>
+            <w:r>
+              <w:t xml:space="preserve">P7</w:t>
+            </w:r>
+          </w:p>
+        </w:tc>
+        <w:tc>
+          <w:p>
+            <w:pPr>
+              <w:pStyle w:val="Compact"/>
+              <w:jc w:val="left"/>
+            </w:pPr>
+            <w:r>
+              <w:t xml:space="preserve">three-voices rubric, from B — bullish discrimination</w:t>
+            </w:r>
+          </w:p>
+        </w:tc>
+        <w:tc>
+          <w:p>
+            <w:pPr>
+              <w:pStyle w:val="Compact"/>
+              <w:jc w:val="left"/>
+            </w:pPr>
+            <w:r>
+              <w:t xml:space="preserve">next candidate (§5.3)</w:t>
+            </w:r>
+          </w:p>
+        </w:tc>
+      </w:tr>
+      <w:tr>
+        <w:tc>
+          <w:p>
+            <w:pPr>
+              <w:pStyle w:val="Compact"/>
+              <w:jc w:val="left"/>
+            </w:pPr>
+            <w:r>
+              <w:t xml:space="preserve">P9</w:t>
+            </w:r>
+          </w:p>
+        </w:tc>
+        <w:tc>
+          <w:p>
+            <w:pPr>
+              <w:pStyle w:val="Compact"/>
+              <w:jc w:val="left"/>
+            </w:pPr>
+            <w:r>
+              <w:t xml:space="preserve">expected-return output, from B — magnitude and calibration</w:t>
+            </w:r>
+          </w:p>
+        </w:tc>
+        <w:tc>
+          <w:p>
+            <w:pPr>
+              <w:pStyle w:val="Compact"/>
+              <w:jc w:val="left"/>
+            </w:pPr>
+            <w:r>
+              <w:t xml:space="preserve">named (§5.3)</w:t>
+            </w:r>
+          </w:p>
+        </w:tc>
+      </w:tr>
+      <w:tr>
+        <w:tc>
+          <w:p>
+            <w:pPr>
+              <w:pStyle w:val="Compact"/>
+              <w:jc w:val="left"/>
+            </w:pPr>
+            <w:r>
+              <w:t xml:space="preserve">—</w:t>
+            </w:r>
+          </w:p>
+        </w:tc>
+        <w:tc>
+          <w:p>
+            <w:pPr>
+              <w:pStyle w:val="Compact"/>
+              <w:jc w:val="left"/>
+            </w:pPr>
+            <w:r>
+              <w:t xml:space="preserve">model gate on B, §2.2b equivalence hurdle</w:t>
+            </w:r>
+          </w:p>
+        </w:tc>
+        <w:tc>
+          <w:p>
+            <w:pPr>
+              <w:pStyle w:val="Compact"/>
+              <w:jc w:val="left"/>
+            </w:pPr>
+            <w:r>
+              <w:t xml:space="preserve">named (§5.3)</w:t>
+            </w:r>
+          </w:p>
+        </w:tc>
+      </w:tr>
+      <w:tr>
+        <w:tc>
+          <w:p>
+            <w:pPr>
+              <w:pStyle w:val="Compact"/>
+              <w:jc w:val="left"/>
+            </w:pPr>
+            <w:r>
+              <w:t xml:space="preserve">P8</w:t>
+            </w:r>
+          </w:p>
+        </w:tc>
+        <w:tc>
+          <w:p>
+            <w:pPr>
+              <w:pStyle w:val="Compact"/>
+              <w:jc w:val="left"/>
+            </w:pPr>
+            <w:r>
+              <w:t xml:space="preserve">auto-iterate as generator, from B, with the 2026-09-24 constraints</w:t>
+            </w:r>
+          </w:p>
+        </w:tc>
+        <w:tc>
+          <w:p>
+            <w:pPr>
+              <w:pStyle w:val="Compact"/>
+              <w:jc w:val="left"/>
+            </w:pPr>
+            <w:r>
+              <w:t xml:space="preserve">after P7/P9</w:t>
+            </w:r>
+          </w:p>
+        </w:tc>
+      </w:tr>
+      <w:tr>
+        <w:tc>
+          <w:p>
+            <w:pPr>
+              <w:pStyle w:val="Compact"/>
+              <w:jc w:val="left"/>
+            </w:pPr>
+            <w:r>
               <w:t xml:space="preserve">P4</w:t>
             </w:r>
           </w:p>
@@ -3304,7 +4939,45 @@
               <w:jc w:val="left"/>
             </w:pPr>
             <w:r>
-              <w:t xml:space="preserve">unblocked, not started</w:t>
+              <w:t xml:space="preserve">after the prompt shape settles</w:t>
+            </w:r>
+          </w:p>
+        </w:tc>
+      </w:tr>
+      <w:tr>
+        <w:tc>
+          <w:p>
+            <w:pPr>
+              <w:pStyle w:val="Compact"/>
+              <w:jc w:val="left"/>
+            </w:pPr>
+            <w:r>
+              <w:t xml:space="preserve">P6D</w:t>
+            </w:r>
+          </w:p>
+        </w:tc>
+        <w:tc>
+          <w:p>
+            <w:pPr>
+              <w:pStyle w:val="Compact"/>
+              <w:jc w:val="left"/>
+            </w:pPr>
+            <w:r>
+              <w:t xml:space="preserve">B plus the structured fields the allocator needs</w:t>
+            </w:r>
+          </w:p>
+        </w:tc>
+        <w:tc>
+          <w:p>
+            <w:pPr>
+              <w:pStyle w:val="Compact"/>
+              <w:jc w:val="left"/>
+            </w:pPr>
+            <w:r>
+              <w:rPr>
+                <w:b/>
+              </w:rPr>
+              <w:t xml:space="preserve">deferred to the allocator rebuild</w:t>
             </w:r>
           </w:p>
         </w:tc>
@@ -3462,7 +5135,7 @@
               <w:jc w:val="left"/>
             </w:pPr>
             <w:r>
-              <w:t xml:space="preserve">downgraded (09-23), still blocked on R3</w:t>
+              <w:t xml:space="preserve">downgraded (09-23), blocked on R3</w:t>
             </w:r>
           </w:p>
         </w:tc>
@@ -3472,105 +5145,93 @@
       <w:pPr>
         <w:pStyle w:val="Heading2"/>
       </w:pPr>
-      <w:bookmarkStart w:id="32" w:name="Xbfb4ee8022d4ae1f693763ce31af0642baedb81"/>
+      <w:bookmarkStart w:id="33" w:name="Xbfb4ee8022d4ae1f693763ce31af0642baedb81"/>
       <w:r>
         <w:t xml:space="preserve">§7 Open, not scheduled</w:t>
       </w:r>
-      <w:bookmarkEnd w:id="32"/>
+      <w:bookmarkEnd w:id="33"/>
     </w:p>
     <w:p>
       <w:pPr>
         <w:numPr>
           <w:ilvl w:val="0"/>
-          <w:numId w:val="1008"/>
+          <w:numId w:val="1007"/>
         </w:numPr>
         <w:pStyle w:val="Compact"/>
       </w:pPr>
       <w:r>
-        <w:t xml:space="preserve">Simulate the allocator with B's scores — now §5, no longer open.</w:t>
+        <w:t xml:space="preserve">A larger noise arm to settle the lucky-cached-draw question (35 decisive</w:t>
+      </w:r>
+      <w:r>
+        <w:t xml:space="preserve"> </w:t>
+      </w:r>
+      <w:r>
+        <w:t xml:space="preserve">flips leave p=0.09; ~150 would decide it, ~$40).</w:t>
       </w:r>
     </w:p>
     <w:p>
       <w:pPr>
         <w:numPr>
           <w:ilvl w:val="0"/>
-          <w:numId w:val="1008"/>
+          <w:numId w:val="1007"/>
         </w:numPr>
         <w:pStyle w:val="Compact"/>
       </w:pPr>
       <w:r>
-        <w:t xml:space="preserve">A larger noise arm to settle the lucky-cached-draw question (35 decisive</w:t>
-      </w:r>
-      <w:r>
-        <w:t xml:space="preserve"> </w:t>
-      </w:r>
-      <w:r>
-        <w:t xml:space="preserve">flips leave p=0.09; ~150 would decide it, ~$40).</w:t>
+        <w:t xml:space="preserve">The pooled v6 swap-median discrepancy (7.70 vs 8.7).</w:t>
       </w:r>
     </w:p>
     <w:p>
       <w:pPr>
         <w:numPr>
           <w:ilvl w:val="0"/>
-          <w:numId w:val="1008"/>
+          <w:numId w:val="1007"/>
         </w:numPr>
         <w:pStyle w:val="Compact"/>
       </w:pPr>
       <w:r>
-        <w:t xml:space="preserve">The pooled v6 swap-median discrepancy (7.70 vs 8.7).</w:t>
+        <w:t xml:space="preserve">Bullish-side signal: none of B, C or v6 has any. P7 is the first candidate</w:t>
+      </w:r>
+      <w:r>
+        <w:t xml:space="preserve"> </w:t>
+      </w:r>
+      <w:r>
+        <w:t xml:space="preserve">aimed at it (the gap between what the CFO reported and what the CEO</w:t>
+      </w:r>
+      <w:r>
+        <w:t xml:space="preserve"> </w:t>
+      </w:r>
+      <w:r>
+        <w:t xml:space="preserve">claimed).</w:t>
       </w:r>
     </w:p>
     <w:p>
       <w:pPr>
         <w:numPr>
           <w:ilvl w:val="0"/>
-          <w:numId w:val="1008"/>
+          <w:numId w:val="1007"/>
         </w:numPr>
         <w:pStyle w:val="Compact"/>
       </w:pPr>
       <w:r>
-        <w:t xml:space="preserve">Bullish-side signal: none of B, C or v6 has any. P7 is the first candidate</w:t>
-      </w:r>
-      <w:r>
-        <w:t xml:space="preserve"> </w:t>
-      </w:r>
-      <w:r>
-        <w:t xml:space="preserve">aimed at it (the gap between what the CFO reported and what the CEO</w:t>
-      </w:r>
-      <w:r>
-        <w:t xml:space="preserve"> </w:t>
-      </w:r>
-      <w:r>
-        <w:t xml:space="preserve">claimed).</w:t>
+        <w:t xml:space="preserve">Severity grading below +1: B's score is flat there. Whether a prompt can</w:t>
+      </w:r>
+      <w:r>
+        <w:t xml:space="preserve"> </w:t>
+      </w:r>
+      <w:r>
+        <w:t xml:space="preserve">grade how bad a bad call is remains untested.</w:t>
       </w:r>
     </w:p>
     <w:p>
       <w:pPr>
         <w:numPr>
           <w:ilvl w:val="0"/>
-          <w:numId w:val="1008"/>
+          <w:numId w:val="1007"/>
         </w:numPr>
         <w:pStyle w:val="Compact"/>
       </w:pPr>
       <w:r>
-        <w:t xml:space="preserve">Severity grading below +1: B's score is flat there. Whether a prompt can</w:t>
-      </w:r>
-      <w:r>
-        <w:t xml:space="preserve"> </w:t>
-      </w:r>
-      <w:r>
-        <w:t xml:space="preserve">grade how bad a bad call is remains untested.</w:t>
-      </w:r>
-    </w:p>
-    <w:p>
-      <w:pPr>
-        <w:numPr>
-          <w:ilvl w:val="0"/>
-          <w:numId w:val="1008"/>
-        </w:numPr>
-        <w:pStyle w:val="Compact"/>
-      </w:pPr>
-      <w:r>
         <w:t xml:space="preserve">Settle §3.1a R3; consensus vendors (stalled); ratchetTranche null on 26%</w:t>
       </w:r>
       <w:r>
@@ -3590,11 +5251,11 @@
       <w:pPr>
         <w:pStyle w:val="Heading2"/>
       </w:pPr>
-      <w:bookmarkStart w:id="33" w:name="Xb71bdff1e7ef0f0281ffd31b057a75433f0444e"/>
+      <w:bookmarkStart w:id="34" w:name="Xb71bdff1e7ef0f0281ffd31b057a75433f0444e"/>
       <w:r>
         <w:t xml:space="preserve">§8 Commits this week</w:t>
       </w:r>
-      <w:bookmarkEnd w:id="33"/>
+      <w:bookmarkEnd w:id="34"/>
     </w:p>
     <w:p>
       <w:pPr>
@@ -3673,7 +5334,55 @@
         <w:t xml:space="preserve"> </w:t>
       </w:r>
       <w:r>
-        <w:t xml:space="preserve">P6B tune run and wrap-up.</w:t>
+        <w:t xml:space="preserve">P6B tune run and wrap-up ·</w:t>
+      </w:r>
+      <w:r>
+        <w:t xml:space="preserve"> </w:t>
+      </w:r>
+      <w:r>
+        <w:rPr>
+          <w:rStyle w:val="VerbatimChar"/>
+        </w:rPr>
+        <w:t xml:space="preserve">57f75d1</w:t>
+      </w:r>
+      <w:r>
+        <w:t xml:space="preserve">…</w:t>
+      </w:r>
+      <w:r>
+        <w:rPr>
+          <w:rStyle w:val="VerbatimChar"/>
+        </w:rPr>
+        <w:t xml:space="preserve">522763b</w:t>
+      </w:r>
+      <w:r>
+        <w:t xml:space="preserve"> </w:t>
+      </w:r>
+      <w:r>
+        <w:t xml:space="preserve">P6B end-to-end check and wrap-up ·</w:t>
+      </w:r>
+      <w:r>
+        <w:t xml:space="preserve"> </w:t>
+      </w:r>
+      <w:r>
+        <w:rPr>
+          <w:rStyle w:val="VerbatimChar"/>
+        </w:rPr>
+        <w:t xml:space="preserve">f7e1d98</w:t>
+      </w:r>
+      <w:r>
+        <w:t xml:space="preserve">…</w:t>
+      </w:r>
+      <w:r>
+        <w:rPr>
+          <w:rStyle w:val="VerbatimChar"/>
+        </w:rPr>
+        <w:t xml:space="preserve">16078ce</w:t>
+      </w:r>
+      <w:r>
+        <w:t xml:space="preserve"> </w:t>
+      </w:r>
+      <w:r>
+        <w:t xml:space="preserve">P6B confound and concentration.</w:t>
       </w:r>
     </w:p>
     <w:sectPr/>
@@ -4100,9 +5809,6 @@
     <w:abstractNumId w:val="991"/>
   </w:num>
   <w:num w:numId="1007">
-    <w:abstractNumId w:val="991"/>
-  </w:num>
-  <w:num w:numId="1008">
     <w:abstractNumId w:val="991"/>
   </w:num>
 </w:numbering>

</xml_diff>